<commit_message>
Update Itilium handbook text to match UI screenshots
Co-authored-by: DiStarkova <DiStarkova@users.noreply.github.com>
</commit_message>
<xml_diff>
--- a/Itilium_Изменения_Справочники.docx
+++ b/Itilium_Изменения_Справочники.docx
@@ -2,7 +2,6 @@
 <file path=word/document.xml><?xml version="1.0" encoding="utf-8"?>
 <w:document xmlns:wpc="http://schemas.microsoft.com/office/word/2010/wordprocessingCanvas" xmlns:mo="http://schemas.microsoft.com/office/mac/office/2008/main" xmlns:mc="http://schemas.openxmlformats.org/markup-compatibility/2006" xmlns:mv="urn:schemas-microsoft-com:mac:vml" xmlns:o="urn:schemas-microsoft-com:office:office" xmlns:r="http://schemas.openxmlformats.org/officeDocument/2006/relationships" xmlns:m="http://schemas.openxmlformats.org/officeDocument/2006/math" xmlns:v="urn:schemas-microsoft-com:vml" xmlns:wp14="http://schemas.microsoft.com/office/word/2010/wordprocessingDrawing" xmlns:wp="http://schemas.openxmlformats.org/drawingml/2006/wordprocessingDrawing" xmlns:w10="urn:schemas-microsoft-com:office:word" xmlns:w="http://schemas.openxmlformats.org/wordprocessingml/2006/main" xmlns:w14="http://schemas.microsoft.com/office/word/2010/wordml" xmlns:wpg="http://schemas.microsoft.com/office/word/2010/wordprocessingGroup" xmlns:wpi="http://schemas.microsoft.com/office/word/2010/wordprocessingInk" xmlns:wne="http://schemas.microsoft.com/office/word/2006/wordml" xmlns:wps="http://schemas.microsoft.com/office/word/2010/wordprocessingShape" mc:Ignorable="w14 wp14">
   <w:body>
-    <w:p/>
     <w:p/>
     <w:p/>
     <w:p/>
@@ -20,7 +19,7 @@
           <w:color w:val="003366"/>
           <w:sz w:val="32"/>
         </w:rPr>
-        <w:t>СПРАВОЧНАЯ ДОКУМЕНТАЦИЯ</w:t>
+        <w:t>СПРАВОЧНАЯ ИНСТРУКЦИЯ</w:t>
       </w:r>
     </w:p>
     <w:p>
@@ -34,9 +33,9 @@
           <w:i w:val="0"/>
           <w:sz w:val="28"/>
         </w:rPr>
-        <w:t>Работа со справочниками процесса</w:t>
+        <w:t>«Управление изменениями»</w:t>
         <w:br/>
-        <w:t>«Управление изменениями»</w:t>
+        <w:t>Справочники и матрица состояний</w:t>
       </w:r>
     </w:p>
     <w:p>
@@ -53,7 +52,6 @@
         <w:t>1С:ITILIUM (Итилиум Проф 1.0)</w:t>
       </w:r>
     </w:p>
-    <w:p/>
     <w:p/>
     <w:p/>
     <w:p/>
@@ -110,7 +108,7 @@
           <w:color w:val="787878"/>
           <w:sz w:val="24"/>
         </w:rPr>
-        <w:t>Обновите оглавление: правый клик → «Обновить поле»</w:t>
+        <w:t>Оглавление обновляется в Word: ПКМ → «Обновить поле».</w:t>
       </w:r>
       <w:r>
         <w:fldChar w:fldCharType="end"/>
@@ -126,7 +124,7 @@
         <w:pStyle w:val="Heading1"/>
       </w:pPr>
       <w:r>
-        <w:t>1. Введение</w:t>
+        <w:t>1. Назначение</w:t>
       </w:r>
     </w:p>
     <w:p>
@@ -137,7 +135,7 @@
           <w:i w:val="0"/>
           <w:sz w:val="28"/>
         </w:rPr>
-        <w:t>Настоящий документ содержит справочную информацию по работе со справочниками подсистемы «Управление изменениями» в системе 1С:ITILIUM (Итилиум Проф). Материал основан на официальном руководстве пользователя разработчика «Деснол».</w:t>
+        <w:t>Документ предназначен как «справочник-подсказка» для настройки и работы со справочниками в разделе «Управление изменениями» (документ «Изменение», справочник «Состояния изменений», матрица «Правила перехода» и связанные справочники).</w:t>
       </w:r>
     </w:p>
     <w:p>
@@ -146,9 +144,9 @@
           <w:rFonts w:ascii="Times New Roman" w:hAnsi="Times New Roman" w:eastAsia="Times New Roman"/>
           <w:b w:val="0"/>
           <w:i w:val="0"/>
-          <w:sz w:val="28"/>
+          <w:sz w:val="24"/>
         </w:rPr>
-        <w:t>Процесс управления изменениями предназначен для обработки изменений ИТ-услуг и информационных систем: их анализа, оценки, согласования, контроля реализации и обеспечения согласованного уровня качества услуг.</w:t>
+        <w:t>Формулировки и названия полей приведены под пользовательские формы, как на ваших скриншотах.</w:t>
       </w:r>
     </w:p>
     <w:p>
@@ -156,18 +154,7 @@
         <w:pStyle w:val="Heading1"/>
       </w:pPr>
       <w:r>
-        <w:t>2. Расположение раздела в системе</w:t>
-      </w:r>
-    </w:p>
-    <w:p>
-      <w:r>
-        <w:rPr>
-          <w:rFonts w:ascii="Times New Roman" w:hAnsi="Times New Roman" w:eastAsia="Times New Roman"/>
-          <w:b w:val="0"/>
-          <w:i w:val="0"/>
-          <w:sz w:val="28"/>
-        </w:rPr>
-        <w:t>Путь в системе: главное меню → «Управление изменениями».</w:t>
+        <w:t>2. Где это находится в программе</w:t>
       </w:r>
     </w:p>
     <w:p>
@@ -181,7 +168,21 @@
           <w:i w:val="0"/>
           <w:sz w:val="28"/>
         </w:rPr>
-        <w:t>В данном разделе находятся:</w:t>
+        <w:t>Путь: главное меню → «Управление изменениями».</w:t>
+      </w:r>
+    </w:p>
+    <w:p>
+      <w:pPr>
+        <w:ind w:firstLine="0"/>
+      </w:pPr>
+      <w:r>
+        <w:rPr>
+          <w:rFonts w:ascii="Times New Roman" w:hAnsi="Times New Roman" w:eastAsia="Times New Roman"/>
+          <w:b w:val="0"/>
+          <w:i w:val="0"/>
+          <w:sz w:val="28"/>
+        </w:rPr>
+        <w:t>В панели навигации раздела доступны:</w:t>
       </w:r>
     </w:p>
     <w:p>
@@ -196,7 +197,7 @@
           <w:i w:val="0"/>
           <w:sz w:val="28"/>
         </w:rPr>
-        <w:t>справочники процесса изменений;</w:t>
+        <w:t>«Состояния изменений» — настройка статусов и матрицы переходов;</w:t>
       </w:r>
     </w:p>
     <w:p>
@@ -211,7 +212,7 @@
           <w:i w:val="0"/>
           <w:sz w:val="28"/>
         </w:rPr>
-        <w:t>документ «Изменение»;</w:t>
+        <w:t>«Типы изменений» — классификация изменений и привязка комитетов;</w:t>
       </w:r>
     </w:p>
     <w:p>
@@ -226,7 +227,7 @@
           <w:i w:val="0"/>
           <w:sz w:val="28"/>
         </w:rPr>
-        <w:t>задачи согласования;</w:t>
+        <w:t>«Комитеты по изменениям» — состав согласующих и правила итогов согласования;</w:t>
       </w:r>
     </w:p>
     <w:p>
@@ -241,386 +242,7 @@
           <w:i w:val="0"/>
           <w:sz w:val="28"/>
         </w:rPr>
-        <w:t>отчёты.</w:t>
-      </w:r>
-    </w:p>
-    <w:p>
-      <w:pPr>
-        <w:ind w:firstLine="0"/>
-      </w:pPr>
-      <w:r>
-        <w:rPr>
-          <w:rFonts w:ascii="Times New Roman" w:hAnsi="Times New Roman" w:eastAsia="Times New Roman"/>
-          <w:b/>
-          <w:i w:val="0"/>
-          <w:sz w:val="28"/>
-        </w:rPr>
-        <w:t>Объекты панели навигации:</w:t>
-      </w:r>
-    </w:p>
-    <w:tbl>
-      <w:tblPr>
-        <w:tblStyle w:val="TableGrid"/>
-        <w:tblW w:type="auto" w:w="0"/>
-        <w:tblLook w:firstColumn="1" w:firstRow="1" w:lastColumn="0" w:lastRow="0" w:noHBand="0" w:noVBand="1" w:val="04A0"/>
-      </w:tblPr>
-      <w:tblGrid>
-        <w:gridCol w:w="4844"/>
-        <w:gridCol w:w="4844"/>
-      </w:tblGrid>
-      <w:tr>
-        <w:tc>
-          <w:tcPr>
-            <w:tcW w:type="dxa" w:w="4844"/>
-            <w:shd w:fill="003366"/>
-          </w:tcPr>
-          <w:p>
-            <w:pPr>
-              <w:jc w:val="center"/>
-            </w:pPr>
-            <w:r/>
-            <w:r>
-              <w:rPr>
-                <w:rFonts w:ascii="Times New Roman" w:hAnsi="Times New Roman" w:eastAsia="Times New Roman"/>
-                <w:b/>
-                <w:i w:val="0"/>
-                <w:color w:val="FFFFFF"/>
-                <w:sz w:val="24"/>
-              </w:rPr>
-              <w:t>Объект</w:t>
-            </w:r>
-          </w:p>
-        </w:tc>
-        <w:tc>
-          <w:tcPr>
-            <w:tcW w:type="dxa" w:w="4844"/>
-            <w:shd w:fill="003366"/>
-          </w:tcPr>
-          <w:p>
-            <w:pPr>
-              <w:jc w:val="center"/>
-            </w:pPr>
-            <w:r/>
-            <w:r>
-              <w:rPr>
-                <w:rFonts w:ascii="Times New Roman" w:hAnsi="Times New Roman" w:eastAsia="Times New Roman"/>
-                <w:b/>
-                <w:i w:val="0"/>
-                <w:color w:val="FFFFFF"/>
-                <w:sz w:val="24"/>
-              </w:rPr>
-              <w:t>Ссылка в навигации</w:t>
-            </w:r>
-          </w:p>
-        </w:tc>
-      </w:tr>
-      <w:tr>
-        <w:tc>
-          <w:tcPr>
-            <w:tcW w:type="dxa" w:w="4844"/>
-          </w:tcPr>
-          <w:p>
-            <w:r/>
-            <w:r>
-              <w:rPr>
-                <w:rFonts w:ascii="Times New Roman" w:hAnsi="Times New Roman" w:eastAsia="Times New Roman"/>
-                <w:b w:val="0"/>
-                <w:i w:val="0"/>
-                <w:sz w:val="24"/>
-              </w:rPr>
-              <w:t>Справочник «Типы изменений»</w:t>
-            </w:r>
-          </w:p>
-        </w:tc>
-        <w:tc>
-          <w:tcPr>
-            <w:tcW w:type="dxa" w:w="4844"/>
-          </w:tcPr>
-          <w:p>
-            <w:r/>
-            <w:r>
-              <w:rPr>
-                <w:rFonts w:ascii="Times New Roman" w:hAnsi="Times New Roman" w:eastAsia="Times New Roman"/>
-                <w:b w:val="0"/>
-                <w:i w:val="0"/>
-                <w:sz w:val="24"/>
-              </w:rPr>
-              <w:t>Типы изменений</w:t>
-            </w:r>
-          </w:p>
-        </w:tc>
-      </w:tr>
-      <w:tr>
-        <w:tc>
-          <w:tcPr>
-            <w:tcW w:type="dxa" w:w="4844"/>
-          </w:tcPr>
-          <w:p>
-            <w:r/>
-            <w:r>
-              <w:rPr>
-                <w:rFonts w:ascii="Times New Roman" w:hAnsi="Times New Roman" w:eastAsia="Times New Roman"/>
-                <w:b w:val="0"/>
-                <w:i w:val="0"/>
-                <w:sz w:val="24"/>
-              </w:rPr>
-              <w:t>Справочник «Состояния изменений»</w:t>
-            </w:r>
-          </w:p>
-        </w:tc>
-        <w:tc>
-          <w:tcPr>
-            <w:tcW w:type="dxa" w:w="4844"/>
-          </w:tcPr>
-          <w:p>
-            <w:r/>
-            <w:r>
-              <w:rPr>
-                <w:rFonts w:ascii="Times New Roman" w:hAnsi="Times New Roman" w:eastAsia="Times New Roman"/>
-                <w:b w:val="0"/>
-                <w:i w:val="0"/>
-                <w:sz w:val="24"/>
-              </w:rPr>
-              <w:t>Состояния изменений</w:t>
-            </w:r>
-          </w:p>
-        </w:tc>
-      </w:tr>
-      <w:tr>
-        <w:tc>
-          <w:tcPr>
-            <w:tcW w:type="dxa" w:w="4844"/>
-          </w:tcPr>
-          <w:p>
-            <w:r/>
-            <w:r>
-              <w:rPr>
-                <w:rFonts w:ascii="Times New Roman" w:hAnsi="Times New Roman" w:eastAsia="Times New Roman"/>
-                <w:b w:val="0"/>
-                <w:i w:val="0"/>
-                <w:sz w:val="24"/>
-              </w:rPr>
-              <w:t>Справочник «Комитеты по изменениям»</w:t>
-            </w:r>
-          </w:p>
-        </w:tc>
-        <w:tc>
-          <w:tcPr>
-            <w:tcW w:type="dxa" w:w="4844"/>
-          </w:tcPr>
-          <w:p>
-            <w:r/>
-            <w:r>
-              <w:rPr>
-                <w:rFonts w:ascii="Times New Roman" w:hAnsi="Times New Roman" w:eastAsia="Times New Roman"/>
-                <w:b w:val="0"/>
-                <w:i w:val="0"/>
-                <w:sz w:val="24"/>
-              </w:rPr>
-              <w:t>Комитеты по изменениям</w:t>
-            </w:r>
-          </w:p>
-        </w:tc>
-      </w:tr>
-      <w:tr>
-        <w:tc>
-          <w:tcPr>
-            <w:tcW w:type="dxa" w:w="4844"/>
-          </w:tcPr>
-          <w:p>
-            <w:r/>
-            <w:r>
-              <w:rPr>
-                <w:rFonts w:ascii="Times New Roman" w:hAnsi="Times New Roman" w:eastAsia="Times New Roman"/>
-                <w:b w:val="0"/>
-                <w:i w:val="0"/>
-                <w:sz w:val="24"/>
-              </w:rPr>
-              <w:t>Справочник «Коды закрытия изменений»</w:t>
-            </w:r>
-          </w:p>
-        </w:tc>
-        <w:tc>
-          <w:tcPr>
-            <w:tcW w:type="dxa" w:w="4844"/>
-          </w:tcPr>
-          <w:p>
-            <w:r/>
-            <w:r>
-              <w:rPr>
-                <w:rFonts w:ascii="Times New Roman" w:hAnsi="Times New Roman" w:eastAsia="Times New Roman"/>
-                <w:b w:val="0"/>
-                <w:i w:val="0"/>
-                <w:sz w:val="24"/>
-              </w:rPr>
-              <w:t>Коды закрытия изменений</w:t>
-            </w:r>
-          </w:p>
-        </w:tc>
-      </w:tr>
-      <w:tr>
-        <w:tc>
-          <w:tcPr>
-            <w:tcW w:type="dxa" w:w="4844"/>
-          </w:tcPr>
-          <w:p>
-            <w:r/>
-            <w:r>
-              <w:rPr>
-                <w:rFonts w:ascii="Times New Roman" w:hAnsi="Times New Roman" w:eastAsia="Times New Roman"/>
-                <w:b w:val="0"/>
-                <w:i w:val="0"/>
-                <w:sz w:val="24"/>
-              </w:rPr>
-              <w:t>Документ «Изменение»</w:t>
-            </w:r>
-          </w:p>
-        </w:tc>
-        <w:tc>
-          <w:tcPr>
-            <w:tcW w:type="dxa" w:w="4844"/>
-          </w:tcPr>
-          <w:p>
-            <w:r/>
-            <w:r>
-              <w:rPr>
-                <w:rFonts w:ascii="Times New Roman" w:hAnsi="Times New Roman" w:eastAsia="Times New Roman"/>
-                <w:b w:val="0"/>
-                <w:i w:val="0"/>
-                <w:sz w:val="24"/>
-              </w:rPr>
-              <w:t>Все</w:t>
-            </w:r>
-          </w:p>
-        </w:tc>
-      </w:tr>
-      <w:tr>
-        <w:tc>
-          <w:tcPr>
-            <w:tcW w:type="dxa" w:w="4844"/>
-          </w:tcPr>
-          <w:p>
-            <w:r/>
-            <w:r>
-              <w:rPr>
-                <w:rFonts w:ascii="Times New Roman" w:hAnsi="Times New Roman" w:eastAsia="Times New Roman"/>
-                <w:b w:val="0"/>
-                <w:i w:val="0"/>
-                <w:sz w:val="24"/>
-              </w:rPr>
-              <w:t>Задачи согласования</w:t>
-            </w:r>
-          </w:p>
-        </w:tc>
-        <w:tc>
-          <w:tcPr>
-            <w:tcW w:type="dxa" w:w="4844"/>
-          </w:tcPr>
-          <w:p>
-            <w:r/>
-            <w:r>
-              <w:rPr>
-                <w:rFonts w:ascii="Times New Roman" w:hAnsi="Times New Roman" w:eastAsia="Times New Roman"/>
-                <w:b w:val="0"/>
-                <w:i w:val="0"/>
-                <w:sz w:val="24"/>
-              </w:rPr>
-              <w:t>Все согласования изменений</w:t>
-            </w:r>
-          </w:p>
-        </w:tc>
-      </w:tr>
-      <w:tr>
-        <w:tc>
-          <w:tcPr>
-            <w:tcW w:type="dxa" w:w="4844"/>
-          </w:tcPr>
-          <w:p>
-            <w:r/>
-            <w:r>
-              <w:rPr>
-                <w:rFonts w:ascii="Times New Roman" w:hAnsi="Times New Roman" w:eastAsia="Times New Roman"/>
-                <w:b w:val="0"/>
-                <w:i w:val="0"/>
-                <w:sz w:val="24"/>
-              </w:rPr>
-              <w:t>Отчёт «Реестр изменений»</w:t>
-            </w:r>
-          </w:p>
-        </w:tc>
-        <w:tc>
-          <w:tcPr>
-            <w:tcW w:type="dxa" w:w="4844"/>
-          </w:tcPr>
-          <w:p>
-            <w:r/>
-            <w:r>
-              <w:rPr>
-                <w:rFonts w:ascii="Times New Roman" w:hAnsi="Times New Roman" w:eastAsia="Times New Roman"/>
-                <w:b w:val="0"/>
-                <w:i w:val="0"/>
-                <w:sz w:val="24"/>
-              </w:rPr>
-              <w:t>Все отчеты → Реестр изменений</w:t>
-            </w:r>
-          </w:p>
-        </w:tc>
-      </w:tr>
-      <w:tr>
-        <w:tc>
-          <w:tcPr>
-            <w:tcW w:type="dxa" w:w="4844"/>
-          </w:tcPr>
-          <w:p>
-            <w:r/>
-            <w:r>
-              <w:rPr>
-                <w:rFonts w:ascii="Times New Roman" w:hAnsi="Times New Roman" w:eastAsia="Times New Roman"/>
-                <w:b w:val="0"/>
-                <w:i w:val="0"/>
-                <w:sz w:val="24"/>
-              </w:rPr>
-              <w:t>Отчёт «Задачи для утверждения»</w:t>
-            </w:r>
-          </w:p>
-        </w:tc>
-        <w:tc>
-          <w:tcPr>
-            <w:tcW w:type="dxa" w:w="4844"/>
-          </w:tcPr>
-          <w:p>
-            <w:r/>
-            <w:r>
-              <w:rPr>
-                <w:rFonts w:ascii="Times New Roman" w:hAnsi="Times New Roman" w:eastAsia="Times New Roman"/>
-                <w:b w:val="0"/>
-                <w:i w:val="0"/>
-                <w:sz w:val="24"/>
-              </w:rPr>
-              <w:t>Все отчеты → Задачи для утверждения</w:t>
-            </w:r>
-          </w:p>
-        </w:tc>
-      </w:tr>
-    </w:tbl>
-    <w:p/>
-    <w:p>
-      <w:pPr>
-        <w:pStyle w:val="Heading1"/>
-      </w:pPr>
-      <w:r>
-        <w:t>3. Порядок первоначальной настройки справочников</w:t>
-      </w:r>
-    </w:p>
-    <w:p>
-      <w:r>
-        <w:rPr>
-          <w:rFonts w:ascii="Times New Roman" w:hAnsi="Times New Roman" w:eastAsia="Times New Roman"/>
-          <w:b w:val="0"/>
-          <w:i w:val="0"/>
-          <w:sz w:val="28"/>
-        </w:rPr>
-        <w:t>Перед началом работы с документами «Изменение» справочники рекомендуется заполнять в следующем порядке:</w:t>
+        <w:t>«Коды закрытия изменений» — аналитика закрытия;</w:t>
       </w:r>
     </w:p>
     <w:p>
@@ -635,7 +257,15 @@
           <w:i w:val="0"/>
           <w:sz w:val="28"/>
         </w:rPr>
-        <w:t>1. Коды закрытия изменений</w:t>
+        <w:t>«Все» — список документов «Изменение».</w:t>
+      </w:r>
+    </w:p>
+    <w:p>
+      <w:pPr>
+        <w:pStyle w:val="Heading1"/>
+      </w:pPr>
+      <w:r>
+        <w:t>3. Рекомендуемый порядок заполнения справочников</w:t>
       </w:r>
     </w:p>
     <w:p>
@@ -650,7 +280,7 @@
           <w:i w:val="0"/>
           <w:sz w:val="28"/>
         </w:rPr>
-        <w:t>2. Состояния изменений (с настройкой матрицы переходов)</w:t>
+        <w:t>1) «Коды закрытия изменений»</w:t>
       </w:r>
     </w:p>
     <w:p>
@@ -665,7 +295,7 @@
           <w:i w:val="0"/>
           <w:sz w:val="28"/>
         </w:rPr>
-        <w:t>3. Комитеты по изменениям</w:t>
+        <w:t>2) «Состояния изменений» + вкладка «Правила перехода» (матрица)</w:t>
       </w:r>
     </w:p>
     <w:p>
@@ -680,7 +310,7 @@
           <w:i w:val="0"/>
           <w:sz w:val="28"/>
         </w:rPr>
-        <w:t>4. Типы изменений (с привязкой комитетов)</w:t>
+        <w:t>3) «Комитеты по изменениям»</w:t>
       </w:r>
     </w:p>
     <w:p>
@@ -695,7 +325,22 @@
           <w:i w:val="0"/>
           <w:sz w:val="28"/>
         </w:rPr>
-        <w:t>5. Общие справочники: Категории документов, Приоритеты</w:t>
+        <w:t>4) «Типы изменений» (с привязкой комитетов)</w:t>
+      </w:r>
+    </w:p>
+    <w:p>
+      <w:pPr>
+        <w:pStyle w:val="ListBullet"/>
+        <w:ind w:firstLine="0" w:left="709"/>
+      </w:pPr>
+      <w:r>
+        <w:rPr>
+          <w:rFonts w:ascii="Times New Roman" w:hAnsi="Times New Roman" w:eastAsia="Times New Roman"/>
+          <w:b w:val="0"/>
+          <w:i w:val="0"/>
+          <w:sz w:val="28"/>
+        </w:rPr>
+        <w:t>5) Общие: «Категории документов», «Приоритеты»</w:t>
       </w:r>
     </w:p>
     <w:p>
@@ -706,7 +351,7 @@
           <w:i w:val="0"/>
           <w:sz w:val="24"/>
         </w:rPr>
-        <w:t>Такой порядок обусловлен зависимостями: тип изменения ссылается на комитеты; комитеты — на состояния; состояния — на коды закрытия.</w:t>
+        <w:t>Причина: справочники связаны ссылками (например, в состоянии можно назначать «Код закрытия по умолчанию», в комитетах — состояния итогов согласования, в типах — комитеты).</w:t>
       </w:r>
     </w:p>
     <w:p>
@@ -714,7 +359,15 @@
         <w:pStyle w:val="Heading1"/>
       </w:pPr>
       <w:r>
-        <w:t>4. Справочник «Типы изменений»</w:t>
+        <w:t>4. Справочник «Состояния изменений» (как на скриншоте)</w:t>
+      </w:r>
+    </w:p>
+    <w:p>
+      <w:pPr>
+        <w:pStyle w:val="Heading2"/>
+      </w:pPr>
+      <w:r>
+        <w:t>4.1. Список состояний</w:t>
       </w:r>
     </w:p>
     <w:p>
@@ -725,7 +378,7 @@
           <w:i w:val="0"/>
           <w:sz w:val="28"/>
         </w:rPr>
-        <w:t>Справочник предназначен для хранения типов документа «Изменение», которые детализируют сведения о срочности и критичности изменения и влияют на процесс его обработки.</w:t>
+        <w:t>В списке вы создаёте/редактируете статусы документа «Изменение». Рекомендуется завести минимальный набор: «Новое», «На согласовании», «Утверждено», «В работе», «Закрыто», «Отклонено».</w:t>
       </w:r>
     </w:p>
     <w:p>
@@ -733,7 +386,21 @@
         <w:pStyle w:val="Heading2"/>
       </w:pPr>
       <w:r>
-        <w:t>4.1. Реквизиты элемента</w:t>
+        <w:t>4.2. Карточка состояния (поля формы)</w:t>
+      </w:r>
+    </w:p>
+    <w:p>
+      <w:pPr>
+        <w:ind w:firstLine="0"/>
+      </w:pPr>
+      <w:r>
+        <w:rPr>
+          <w:rFonts w:ascii="Times New Roman" w:hAnsi="Times New Roman" w:eastAsia="Times New Roman"/>
+          <w:b w:val="0"/>
+          <w:i w:val="0"/>
+          <w:sz w:val="28"/>
+        </w:rPr>
+        <w:t>В карточке состояния доступны (по вашему интерфейсу):</w:t>
       </w:r>
     </w:p>
     <w:tbl>
@@ -787,7 +454,7 @@
                 <w:color w:val="FFFFFF"/>
                 <w:sz w:val="24"/>
               </w:rPr>
-              <w:t>Описание</w:t>
+              <w:t>Что означает и как использовать</w:t>
             </w:r>
           </w:p>
         </w:tc>
@@ -823,7 +490,7 @@
                 <w:i w:val="0"/>
                 <w:sz w:val="24"/>
               </w:rPr>
-              <w:t>Системный код типа изменения</w:t>
+              <w:t>Технический код состояния.</w:t>
             </w:r>
           </w:p>
         </w:tc>
@@ -859,7 +526,7 @@
                 <w:i w:val="0"/>
                 <w:sz w:val="24"/>
               </w:rPr>
-              <w:t>Название типа (например: «Стандартное», «Срочное»)</w:t>
+              <w:t>Название статуса (отображается в документе «Изменение»).</w:t>
             </w:r>
           </w:p>
         </w:tc>
@@ -895,410 +562,7 @@
                 <w:i w:val="0"/>
                 <w:sz w:val="24"/>
               </w:rPr>
-              <w:t>Дополнительное текстовое описание</w:t>
-            </w:r>
-          </w:p>
-        </w:tc>
-      </w:tr>
-    </w:tbl>
-    <w:p/>
-    <w:p>
-      <w:pPr>
-        <w:pStyle w:val="Heading2"/>
-      </w:pPr>
-      <w:r>
-        <w:t>4.2. Табличная часть «Согласующие комитеты»</w:t>
-      </w:r>
-    </w:p>
-    <w:p>
-      <w:r>
-        <w:rPr>
-          <w:rFonts w:ascii="Times New Roman" w:hAnsi="Times New Roman" w:eastAsia="Times New Roman"/>
-          <w:b w:val="0"/>
-          <w:i w:val="0"/>
-          <w:sz w:val="28"/>
-        </w:rPr>
-        <w:t>Содержит список комитетов из справочника «Комитеты по изменениям», которые согласуют изменения данного типа.</w:t>
-      </w:r>
-    </w:p>
-    <w:p>
-      <w:pPr>
-        <w:ind w:firstLine="0"/>
-      </w:pPr>
-      <w:r>
-        <w:rPr>
-          <w:rFonts w:ascii="Times New Roman" w:hAnsi="Times New Roman" w:eastAsia="Times New Roman"/>
-          <w:b/>
-          <w:i w:val="0"/>
-          <w:sz w:val="28"/>
-        </w:rPr>
-        <w:t>Пример настройки:</w:t>
-      </w:r>
-    </w:p>
-    <w:tbl>
-      <w:tblPr>
-        <w:tblStyle w:val="TableGrid"/>
-        <w:tblW w:type="auto" w:w="0"/>
-        <w:tblLook w:firstColumn="1" w:firstRow="1" w:lastColumn="0" w:lastRow="0" w:noHBand="0" w:noVBand="1" w:val="04A0"/>
-      </w:tblPr>
-      <w:tblGrid>
-        <w:gridCol w:w="4844"/>
-        <w:gridCol w:w="4844"/>
-      </w:tblGrid>
-      <w:tr>
-        <w:tc>
-          <w:tcPr>
-            <w:tcW w:type="dxa" w:w="4844"/>
-            <w:shd w:fill="003366"/>
-          </w:tcPr>
-          <w:p>
-            <w:pPr>
-              <w:jc w:val="center"/>
-            </w:pPr>
-            <w:r/>
-            <w:r>
-              <w:rPr>
-                <w:rFonts w:ascii="Times New Roman" w:hAnsi="Times New Roman" w:eastAsia="Times New Roman"/>
-                <w:b/>
-                <w:i w:val="0"/>
-                <w:color w:val="FFFFFF"/>
-                <w:sz w:val="24"/>
-              </w:rPr>
-              <w:t>Тип изменения</w:t>
-            </w:r>
-          </w:p>
-        </w:tc>
-        <w:tc>
-          <w:tcPr>
-            <w:tcW w:type="dxa" w:w="4844"/>
-            <w:shd w:fill="003366"/>
-          </w:tcPr>
-          <w:p>
-            <w:pPr>
-              <w:jc w:val="center"/>
-            </w:pPr>
-            <w:r/>
-            <w:r>
-              <w:rPr>
-                <w:rFonts w:ascii="Times New Roman" w:hAnsi="Times New Roman" w:eastAsia="Times New Roman"/>
-                <w:b/>
-                <w:i w:val="0"/>
-                <w:color w:val="FFFFFF"/>
-                <w:sz w:val="24"/>
-              </w:rPr>
-              <w:t>Комитеты</w:t>
-            </w:r>
-          </w:p>
-        </w:tc>
-      </w:tr>
-      <w:tr>
-        <w:tc>
-          <w:tcPr>
-            <w:tcW w:type="dxa" w:w="4844"/>
-          </w:tcPr>
-          <w:p>
-            <w:r/>
-            <w:r>
-              <w:rPr>
-                <w:rFonts w:ascii="Times New Roman" w:hAnsi="Times New Roman" w:eastAsia="Times New Roman"/>
-                <w:b w:val="0"/>
-                <w:i w:val="0"/>
-                <w:sz w:val="24"/>
-              </w:rPr>
-              <w:t>Стандартное</w:t>
-            </w:r>
-          </w:p>
-        </w:tc>
-        <w:tc>
-          <w:tcPr>
-            <w:tcW w:type="dxa" w:w="4844"/>
-          </w:tcPr>
-          <w:p>
-            <w:r/>
-            <w:r>
-              <w:rPr>
-                <w:rFonts w:ascii="Times New Roman" w:hAnsi="Times New Roman" w:eastAsia="Times New Roman"/>
-                <w:b w:val="0"/>
-                <w:i w:val="0"/>
-                <w:sz w:val="24"/>
-              </w:rPr>
-              <w:t>CAB — общий</w:t>
-            </w:r>
-          </w:p>
-        </w:tc>
-      </w:tr>
-      <w:tr>
-        <w:tc>
-          <w:tcPr>
-            <w:tcW w:type="dxa" w:w="4844"/>
-          </w:tcPr>
-          <w:p>
-            <w:r/>
-            <w:r>
-              <w:rPr>
-                <w:rFonts w:ascii="Times New Roman" w:hAnsi="Times New Roman" w:eastAsia="Times New Roman"/>
-                <w:b w:val="0"/>
-                <w:i w:val="0"/>
-                <w:sz w:val="24"/>
-              </w:rPr>
-              <w:t>Срочное</w:t>
-            </w:r>
-          </w:p>
-        </w:tc>
-        <w:tc>
-          <w:tcPr>
-            <w:tcW w:type="dxa" w:w="4844"/>
-          </w:tcPr>
-          <w:p>
-            <w:r/>
-            <w:r>
-              <w:rPr>
-                <w:rFonts w:ascii="Times New Roman" w:hAnsi="Times New Roman" w:eastAsia="Times New Roman"/>
-                <w:b w:val="0"/>
-                <w:i w:val="0"/>
-                <w:sz w:val="24"/>
-              </w:rPr>
-              <w:t>CAB — общий + CAB — инфраструктура</w:t>
-            </w:r>
-          </w:p>
-        </w:tc>
-      </w:tr>
-      <w:tr>
-        <w:tc>
-          <w:tcPr>
-            <w:tcW w:type="dxa" w:w="4844"/>
-          </w:tcPr>
-          <w:p>
-            <w:r/>
-            <w:r>
-              <w:rPr>
-                <w:rFonts w:ascii="Times New Roman" w:hAnsi="Times New Roman" w:eastAsia="Times New Roman"/>
-                <w:b w:val="0"/>
-                <w:i w:val="0"/>
-                <w:sz w:val="24"/>
-              </w:rPr>
-              <w:t>Экстренное</w:t>
-            </w:r>
-          </w:p>
-        </w:tc>
-        <w:tc>
-          <w:tcPr>
-            <w:tcW w:type="dxa" w:w="4844"/>
-          </w:tcPr>
-          <w:p>
-            <w:r/>
-            <w:r>
-              <w:rPr>
-                <w:rFonts w:ascii="Times New Roman" w:hAnsi="Times New Roman" w:eastAsia="Times New Roman"/>
-                <w:b w:val="0"/>
-                <w:i w:val="0"/>
-                <w:sz w:val="24"/>
-              </w:rPr>
-              <w:t>CAB — экстренный</w:t>
-            </w:r>
-          </w:p>
-        </w:tc>
-      </w:tr>
-    </w:tbl>
-    <w:p/>
-    <w:p>
-      <w:r>
-        <w:rPr>
-          <w:rFonts w:ascii="Times New Roman" w:hAnsi="Times New Roman" w:eastAsia="Times New Roman"/>
-          <w:b w:val="0"/>
-          <w:i w:val="0"/>
-          <w:sz w:val="24"/>
-        </w:rPr>
-        <w:t>Используется в поле «Тип» документа «Изменение».</w:t>
-      </w:r>
-    </w:p>
-    <w:p>
-      <w:pPr>
-        <w:pStyle w:val="Heading1"/>
-      </w:pPr>
-      <w:r>
-        <w:t>5. Справочник «Состояния изменений»</w:t>
-      </w:r>
-    </w:p>
-    <w:p>
-      <w:r>
-        <w:rPr>
-          <w:rFonts w:ascii="Times New Roman" w:hAnsi="Times New Roman" w:eastAsia="Times New Roman"/>
-          <w:b w:val="0"/>
-          <w:i w:val="0"/>
-          <w:sz w:val="28"/>
-        </w:rPr>
-        <w:t>Справочник содержит перечень состояний документа «Изменение» и правила последовательности смены этих состояний (жизненный цикл изменения).</w:t>
-      </w:r>
-    </w:p>
-    <w:p>
-      <w:pPr>
-        <w:pStyle w:val="Heading2"/>
-      </w:pPr>
-      <w:r>
-        <w:t>5.1. Реквизиты элемента</w:t>
-      </w:r>
-    </w:p>
-    <w:tbl>
-      <w:tblPr>
-        <w:tblStyle w:val="TableGrid"/>
-        <w:tblW w:type="auto" w:w="0"/>
-        <w:tblLook w:firstColumn="1" w:firstRow="1" w:lastColumn="0" w:lastRow="0" w:noHBand="0" w:noVBand="1" w:val="04A0"/>
-      </w:tblPr>
-      <w:tblGrid>
-        <w:gridCol w:w="4844"/>
-        <w:gridCol w:w="4844"/>
-      </w:tblGrid>
-      <w:tr>
-        <w:tc>
-          <w:tcPr>
-            <w:tcW w:type="dxa" w:w="4844"/>
-            <w:shd w:fill="003366"/>
-          </w:tcPr>
-          <w:p>
-            <w:pPr>
-              <w:jc w:val="center"/>
-            </w:pPr>
-            <w:r/>
-            <w:r>
-              <w:rPr>
-                <w:rFonts w:ascii="Times New Roman" w:hAnsi="Times New Roman" w:eastAsia="Times New Roman"/>
-                <w:b/>
-                <w:i w:val="0"/>
-                <w:color w:val="FFFFFF"/>
-                <w:sz w:val="24"/>
-              </w:rPr>
-              <w:t>Поле</w:t>
-            </w:r>
-          </w:p>
-        </w:tc>
-        <w:tc>
-          <w:tcPr>
-            <w:tcW w:type="dxa" w:w="4844"/>
-            <w:shd w:fill="003366"/>
-          </w:tcPr>
-          <w:p>
-            <w:pPr>
-              <w:jc w:val="center"/>
-            </w:pPr>
-            <w:r/>
-            <w:r>
-              <w:rPr>
-                <w:rFonts w:ascii="Times New Roman" w:hAnsi="Times New Roman" w:eastAsia="Times New Roman"/>
-                <w:b/>
-                <w:i w:val="0"/>
-                <w:color w:val="FFFFFF"/>
-                <w:sz w:val="24"/>
-              </w:rPr>
-              <w:t>Описание</w:t>
-            </w:r>
-          </w:p>
-        </w:tc>
-      </w:tr>
-      <w:tr>
-        <w:tc>
-          <w:tcPr>
-            <w:tcW w:type="dxa" w:w="4844"/>
-          </w:tcPr>
-          <w:p>
-            <w:r/>
-            <w:r>
-              <w:rPr>
-                <w:rFonts w:ascii="Times New Roman" w:hAnsi="Times New Roman" w:eastAsia="Times New Roman"/>
-                <w:b w:val="0"/>
-                <w:i w:val="0"/>
-                <w:sz w:val="24"/>
-              </w:rPr>
-              <w:t>Код</w:t>
-            </w:r>
-          </w:p>
-        </w:tc>
-        <w:tc>
-          <w:tcPr>
-            <w:tcW w:type="dxa" w:w="4844"/>
-          </w:tcPr>
-          <w:p>
-            <w:r/>
-            <w:r>
-              <w:rPr>
-                <w:rFonts w:ascii="Times New Roman" w:hAnsi="Times New Roman" w:eastAsia="Times New Roman"/>
-                <w:b w:val="0"/>
-                <w:i w:val="0"/>
-                <w:sz w:val="24"/>
-              </w:rPr>
-              <w:t>Код состояния</w:t>
-            </w:r>
-          </w:p>
-        </w:tc>
-      </w:tr>
-      <w:tr>
-        <w:tc>
-          <w:tcPr>
-            <w:tcW w:type="dxa" w:w="4844"/>
-          </w:tcPr>
-          <w:p>
-            <w:r/>
-            <w:r>
-              <w:rPr>
-                <w:rFonts w:ascii="Times New Roman" w:hAnsi="Times New Roman" w:eastAsia="Times New Roman"/>
-                <w:b w:val="0"/>
-                <w:i w:val="0"/>
-                <w:sz w:val="24"/>
-              </w:rPr>
-              <w:t>Наименование</w:t>
-            </w:r>
-          </w:p>
-        </w:tc>
-        <w:tc>
-          <w:tcPr>
-            <w:tcW w:type="dxa" w:w="4844"/>
-          </w:tcPr>
-          <w:p>
-            <w:r/>
-            <w:r>
-              <w:rPr>
-                <w:rFonts w:ascii="Times New Roman" w:hAnsi="Times New Roman" w:eastAsia="Times New Roman"/>
-                <w:b w:val="0"/>
-                <w:i w:val="0"/>
-                <w:sz w:val="24"/>
-              </w:rPr>
-              <w:t>Название состояния</w:t>
-            </w:r>
-          </w:p>
-        </w:tc>
-      </w:tr>
-      <w:tr>
-        <w:tc>
-          <w:tcPr>
-            <w:tcW w:type="dxa" w:w="4844"/>
-          </w:tcPr>
-          <w:p>
-            <w:r/>
-            <w:r>
-              <w:rPr>
-                <w:rFonts w:ascii="Times New Roman" w:hAnsi="Times New Roman" w:eastAsia="Times New Roman"/>
-                <w:b w:val="0"/>
-                <w:i w:val="0"/>
-                <w:sz w:val="24"/>
-              </w:rPr>
-              <w:t>Комментарий</w:t>
-            </w:r>
-          </w:p>
-        </w:tc>
-        <w:tc>
-          <w:tcPr>
-            <w:tcW w:type="dxa" w:w="4844"/>
-          </w:tcPr>
-          <w:p>
-            <w:r/>
-            <w:r>
-              <w:rPr>
-                <w:rFonts w:ascii="Times New Roman" w:hAnsi="Times New Roman" w:eastAsia="Times New Roman"/>
-                <w:b w:val="0"/>
-                <w:i w:val="0"/>
-                <w:sz w:val="24"/>
-              </w:rPr>
-              <w:t>Пояснение к состоянию</w:t>
+              <w:t>Пояснение для админов/пользователей.</w:t>
             </w:r>
           </w:p>
         </w:tc>
@@ -1334,7 +598,7 @@
                 <w:i w:val="0"/>
                 <w:sz w:val="24"/>
               </w:rPr>
-              <w:t>При переходе отправляется email</w:t>
+              <w:t>Если включено — при переводе изменения в это состояние отправятся уведомления инициатору/оповещаемым.</w:t>
             </w:r>
           </w:p>
         </w:tc>
@@ -1370,7 +634,7 @@
                 <w:i w:val="0"/>
                 <w:sz w:val="24"/>
               </w:rPr>
-              <w:t>Перевод в состояние запускает согласование</w:t>
+              <w:t>Если включено — перевод в это состояние запускает процедуру согласования (задачи согласования).</w:t>
             </w:r>
           </w:p>
         </w:tc>
@@ -1406,7 +670,7 @@
                 <w:i w:val="0"/>
                 <w:sz w:val="24"/>
               </w:rPr>
-              <w:t>Фиксируется время закрытия</w:t>
+              <w:t>Если включено — при переходе фиксируется время закрытия изменения.</w:t>
             </w:r>
           </w:p>
         </w:tc>
@@ -1442,7 +706,7 @@
                 <w:i w:val="0"/>
                 <w:sz w:val="24"/>
               </w:rPr>
-              <w:t>Шаблон письма из справочника «Шаблоны сообщений»</w:t>
+              <w:t>Выбор шаблона письма (из справочника «Шаблоны сообщений») для уведомлений.</w:t>
             </w:r>
           </w:p>
         </w:tc>
@@ -1461,7 +725,7 @@
                 <w:i w:val="0"/>
                 <w:sz w:val="24"/>
               </w:rPr>
-              <w:t>Сделать поле «Код закрытия» обязательным</w:t>
+              <w:t>Сделать поле «Код закрытия» обязательным для заполнения</w:t>
             </w:r>
           </w:p>
         </w:tc>
@@ -1478,7 +742,7 @@
                 <w:i w:val="0"/>
                 <w:sz w:val="24"/>
               </w:rPr>
-              <w:t>Код закрытия обязателен в этом состоянии</w:t>
+              <w:t>Обычно включают для закрывающих состояний, чтобы обязательным был итоговый код закрытия.</w:t>
             </w:r>
           </w:p>
         </w:tc>
@@ -1514,7 +778,7 @@
                 <w:i w:val="0"/>
                 <w:sz w:val="24"/>
               </w:rPr>
-              <w:t>Автоподстановка из «Коды закрытия изменений»</w:t>
+              <w:t>Автоматически подставляется в документе «Изменение» в данном состоянии (из «Коды закрытия изменений»).</w:t>
             </w:r>
           </w:p>
         </w:tc>
@@ -1526,10 +790,13 @@
         <w:pStyle w:val="Heading2"/>
       </w:pPr>
       <w:r>
-        <w:t>5.2. Вкладка «Правила перехода»</w:t>
+        <w:t>4.3. Вкладка «Правила перехода» (матрица переходов)</w:t>
       </w:r>
     </w:p>
     <w:p>
+      <w:pPr>
+        <w:ind w:firstLine="0"/>
+      </w:pPr>
       <w:r>
         <w:rPr>
           <w:rFonts w:ascii="Times New Roman" w:hAnsi="Times New Roman" w:eastAsia="Times New Roman"/>
@@ -1537,7 +804,7 @@
           <w:i w:val="0"/>
           <w:sz w:val="28"/>
         </w:rPr>
-        <w:t>На вкладке формируется матрица переходов между состояниями:</w:t>
+        <w:t>Эта вкладка соответствует вашему скриншоту с матрицей. Настройка выполняется так:</w:t>
       </w:r>
     </w:p>
     <w:p>
@@ -1552,7 +819,7 @@
           <w:i w:val="0"/>
           <w:sz w:val="28"/>
         </w:rPr>
-        <w:t>выбрать роль (начать с «По умолчанию»);</w:t>
+        <w:t>Выберите роль/набор прав, для которого настраивается матрица (обычно начинают с «По умолчанию»).</w:t>
       </w:r>
     </w:p>
     <w:p>
@@ -1567,7 +834,7 @@
           <w:i w:val="0"/>
           <w:sz w:val="28"/>
         </w:rPr>
-        <w:t>строка — текущее состояние, столбец — целевое;</w:t>
+        <w:t>Строка — текущее состояние, столбец — состояние, в которое можно перейти.</w:t>
       </w:r>
     </w:p>
     <w:p>
@@ -1582,7 +849,7 @@
           <w:i w:val="0"/>
           <w:sz w:val="28"/>
         </w:rPr>
-        <w:t>флаг в ячейке — переход разрешён;</w:t>
+        <w:t>Флажок в ячейке означает, что переход разрешён.</w:t>
       </w:r>
     </w:p>
     <w:p>
@@ -1597,40 +864,18 @@
           <w:i w:val="0"/>
           <w:sz w:val="28"/>
         </w:rPr>
-        <w:t>двойной щелчок справа от флага — состояние по умолчанию (зелёная строка).</w:t>
+        <w:t>Одно состояние должно быть состоянием «по умолчанию» при создании изменения (в интерфейсе отмечается подсветкой строки).</w:t>
       </w:r>
     </w:p>
     <w:p>
-      <w:pPr>
-        <w:ind w:firstLine="0"/>
-      </w:pPr>
-      <w:r>
-        <w:rPr>
-          <w:rFonts w:ascii="Times New Roman" w:hAnsi="Times New Roman" w:eastAsia="Times New Roman"/>
-          <w:b/>
-          <w:i w:val="0"/>
-          <w:sz w:val="28"/>
-        </w:rPr>
-        <w:t>Типовая цепочка состояний:</w:t>
-      </w:r>
-    </w:p>
-    <w:p>
-      <w:pPr>
-        <w:ind w:firstLine="0"/>
-        <w:jc w:val="center"/>
-      </w:pPr>
       <w:r>
         <w:rPr>
           <w:rFonts w:ascii="Times New Roman" w:hAnsi="Times New Roman" w:eastAsia="Times New Roman"/>
           <w:b w:val="0"/>
           <w:i w:val="0"/>
-          <w:sz w:val="28"/>
+          <w:sz w:val="24"/>
         </w:rPr>
-        <w:t>Новое → На согласовании → Утверждено → В работе → Закрыто</w:t>
-        <w:br/>
-        <w:t xml:space="preserve">                              ↓</w:t>
-        <w:br/>
-        <w:t xml:space="preserve">                          Отклонено</w:t>
+        <w:t>Рекомендация: сначала заполните матрицу для «По умолчанию», затем скопируйте/распространите правила на нужные роли.</w:t>
       </w:r>
     </w:p>
     <w:p>
@@ -1638,7 +883,7 @@
         <w:pStyle w:val="Heading1"/>
       </w:pPr>
       <w:r>
-        <w:t>6. Справочник «Комитеты по изменениям»</w:t>
+        <w:t>5. Справочник «Комитеты по изменениям»</w:t>
       </w:r>
     </w:p>
     <w:p>
@@ -1649,405 +894,21 @@
           <w:i w:val="0"/>
           <w:sz w:val="28"/>
         </w:rPr>
-        <w:t>Иерархический справочник комитетов по согласованию изменений (CAB — Change Advisory Board) с многоуровневым согласованием.</w:t>
+        <w:t>Комитеты используются для согласования изменений. В комитете задаются уровни согласования, согласующие лица и состояния, которые выставляются после результата согласования (согласовано/с замечаниями/отклонено).</w:t>
       </w:r>
     </w:p>
     <w:p>
       <w:pPr>
-        <w:pStyle w:val="Heading2"/>
+        <w:ind w:firstLine="0"/>
       </w:pPr>
       <w:r>
-        <w:t>6.1. Реквизиты элемента</w:t>
-      </w:r>
-    </w:p>
-    <w:tbl>
-      <w:tblPr>
-        <w:tblStyle w:val="TableGrid"/>
-        <w:tblW w:type="auto" w:w="0"/>
-        <w:tblLook w:firstColumn="1" w:firstRow="1" w:lastColumn="0" w:lastRow="0" w:noHBand="0" w:noVBand="1" w:val="04A0"/>
-      </w:tblPr>
-      <w:tblGrid>
-        <w:gridCol w:w="4844"/>
-        <w:gridCol w:w="4844"/>
-      </w:tblGrid>
-      <w:tr>
-        <w:tc>
-          <w:tcPr>
-            <w:tcW w:type="dxa" w:w="4844"/>
-            <w:shd w:fill="003366"/>
-          </w:tcPr>
-          <w:p>
-            <w:pPr>
-              <w:jc w:val="center"/>
-            </w:pPr>
-            <w:r/>
-            <w:r>
-              <w:rPr>
-                <w:rFonts w:ascii="Times New Roman" w:hAnsi="Times New Roman" w:eastAsia="Times New Roman"/>
-                <w:b/>
-                <w:i w:val="0"/>
-                <w:color w:val="FFFFFF"/>
-                <w:sz w:val="24"/>
-              </w:rPr>
-              <w:t>Поле</w:t>
-            </w:r>
-          </w:p>
-        </w:tc>
-        <w:tc>
-          <w:tcPr>
-            <w:tcW w:type="dxa" w:w="4844"/>
-            <w:shd w:fill="003366"/>
-          </w:tcPr>
-          <w:p>
-            <w:pPr>
-              <w:jc w:val="center"/>
-            </w:pPr>
-            <w:r/>
-            <w:r>
-              <w:rPr>
-                <w:rFonts w:ascii="Times New Roman" w:hAnsi="Times New Roman" w:eastAsia="Times New Roman"/>
-                <w:b/>
-                <w:i w:val="0"/>
-                <w:color w:val="FFFFFF"/>
-                <w:sz w:val="24"/>
-              </w:rPr>
-              <w:t>Описание</w:t>
-            </w:r>
-          </w:p>
-        </w:tc>
-      </w:tr>
-      <w:tr>
-        <w:tc>
-          <w:tcPr>
-            <w:tcW w:type="dxa" w:w="4844"/>
-          </w:tcPr>
-          <w:p>
-            <w:r/>
-            <w:r>
-              <w:rPr>
-                <w:rFonts w:ascii="Times New Roman" w:hAnsi="Times New Roman" w:eastAsia="Times New Roman"/>
-                <w:b w:val="0"/>
-                <w:i w:val="0"/>
-                <w:sz w:val="24"/>
-              </w:rPr>
-              <w:t>Код</w:t>
-            </w:r>
-          </w:p>
-        </w:tc>
-        <w:tc>
-          <w:tcPr>
-            <w:tcW w:type="dxa" w:w="4844"/>
-          </w:tcPr>
-          <w:p>
-            <w:r/>
-            <w:r>
-              <w:rPr>
-                <w:rFonts w:ascii="Times New Roman" w:hAnsi="Times New Roman" w:eastAsia="Times New Roman"/>
-                <w:b w:val="0"/>
-                <w:i w:val="0"/>
-                <w:sz w:val="24"/>
-              </w:rPr>
-              <w:t>Код комитета</w:t>
-            </w:r>
-          </w:p>
-        </w:tc>
-      </w:tr>
-      <w:tr>
-        <w:tc>
-          <w:tcPr>
-            <w:tcW w:type="dxa" w:w="4844"/>
-          </w:tcPr>
-          <w:p>
-            <w:r/>
-            <w:r>
-              <w:rPr>
-                <w:rFonts w:ascii="Times New Roman" w:hAnsi="Times New Roman" w:eastAsia="Times New Roman"/>
-                <w:b w:val="0"/>
-                <w:i w:val="0"/>
-                <w:sz w:val="24"/>
-              </w:rPr>
-              <w:t>Наименование</w:t>
-            </w:r>
-          </w:p>
-        </w:tc>
-        <w:tc>
-          <w:tcPr>
-            <w:tcW w:type="dxa" w:w="4844"/>
-          </w:tcPr>
-          <w:p>
-            <w:r/>
-            <w:r>
-              <w:rPr>
-                <w:rFonts w:ascii="Times New Roman" w:hAnsi="Times New Roman" w:eastAsia="Times New Roman"/>
-                <w:b w:val="0"/>
-                <w:i w:val="0"/>
-                <w:sz w:val="24"/>
-              </w:rPr>
-              <w:t>Название комитета</w:t>
-            </w:r>
-          </w:p>
-        </w:tc>
-      </w:tr>
-      <w:tr>
-        <w:tc>
-          <w:tcPr>
-            <w:tcW w:type="dxa" w:w="4844"/>
-          </w:tcPr>
-          <w:p>
-            <w:r/>
-            <w:r>
-              <w:rPr>
-                <w:rFonts w:ascii="Times New Roman" w:hAnsi="Times New Roman" w:eastAsia="Times New Roman"/>
-                <w:b w:val="0"/>
-                <w:i w:val="0"/>
-                <w:sz w:val="24"/>
-              </w:rPr>
-              <w:t>Срок согласования задачи (дней)</w:t>
-            </w:r>
-          </w:p>
-        </w:tc>
-        <w:tc>
-          <w:tcPr>
-            <w:tcW w:type="dxa" w:w="4844"/>
-          </w:tcPr>
-          <w:p>
-            <w:r/>
-            <w:r>
-              <w:rPr>
-                <w:rFonts w:ascii="Times New Roman" w:hAnsi="Times New Roman" w:eastAsia="Times New Roman"/>
-                <w:b w:val="0"/>
-                <w:i w:val="0"/>
-                <w:sz w:val="24"/>
-              </w:rPr>
-              <w:t>Автосогласование по истечении срока</w:t>
-            </w:r>
-          </w:p>
-        </w:tc>
-      </w:tr>
-      <w:tr>
-        <w:tc>
-          <w:tcPr>
-            <w:tcW w:type="dxa" w:w="4844"/>
-          </w:tcPr>
-          <w:p>
-            <w:r/>
-            <w:r>
-              <w:rPr>
-                <w:rFonts w:ascii="Times New Roman" w:hAnsi="Times New Roman" w:eastAsia="Times New Roman"/>
-                <w:b w:val="0"/>
-                <w:i w:val="0"/>
-                <w:sz w:val="24"/>
-              </w:rPr>
-              <w:t>Клиент</w:t>
-            </w:r>
-          </w:p>
-        </w:tc>
-        <w:tc>
-          <w:tcPr>
-            <w:tcW w:type="dxa" w:w="4844"/>
-          </w:tcPr>
-          <w:p>
-            <w:r/>
-            <w:r>
-              <w:rPr>
-                <w:rFonts w:ascii="Times New Roman" w:hAnsi="Times New Roman" w:eastAsia="Times New Roman"/>
-                <w:b w:val="0"/>
-                <w:i w:val="0"/>
-                <w:sz w:val="24"/>
-              </w:rPr>
-              <w:t>Клиент из справочника «Клиенты»</w:t>
-            </w:r>
-          </w:p>
-        </w:tc>
-      </w:tr>
-      <w:tr>
-        <w:tc>
-          <w:tcPr>
-            <w:tcW w:type="dxa" w:w="4844"/>
-          </w:tcPr>
-          <w:p>
-            <w:r/>
-            <w:r>
-              <w:rPr>
-                <w:rFonts w:ascii="Times New Roman" w:hAnsi="Times New Roman" w:eastAsia="Times New Roman"/>
-                <w:b w:val="0"/>
-                <w:i w:val="0"/>
-                <w:sz w:val="24"/>
-              </w:rPr>
-              <w:t>Время работы</w:t>
-            </w:r>
-          </w:p>
-        </w:tc>
-        <w:tc>
-          <w:tcPr>
-            <w:tcW w:type="dxa" w:w="4844"/>
-          </w:tcPr>
-          <w:p>
-            <w:r/>
-            <w:r>
-              <w:rPr>
-                <w:rFonts w:ascii="Times New Roman" w:hAnsi="Times New Roman" w:eastAsia="Times New Roman"/>
-                <w:b w:val="0"/>
-                <w:i w:val="0"/>
-                <w:sz w:val="24"/>
-              </w:rPr>
-              <w:t>График из «Время оказания услуги»</w:t>
-            </w:r>
-          </w:p>
-        </w:tc>
-      </w:tr>
-      <w:tr>
-        <w:tc>
-          <w:tcPr>
-            <w:tcW w:type="dxa" w:w="4844"/>
-          </w:tcPr>
-          <w:p>
-            <w:r/>
-            <w:r>
-              <w:rPr>
-                <w:rFonts w:ascii="Times New Roman" w:hAnsi="Times New Roman" w:eastAsia="Times New Roman"/>
-                <w:b w:val="0"/>
-                <w:i w:val="0"/>
-                <w:sz w:val="24"/>
-              </w:rPr>
-              <w:t>Если согласовано</w:t>
-            </w:r>
-          </w:p>
-        </w:tc>
-        <w:tc>
-          <w:tcPr>
-            <w:tcW w:type="dxa" w:w="4844"/>
-          </w:tcPr>
-          <w:p>
-            <w:r/>
-            <w:r>
-              <w:rPr>
-                <w:rFonts w:ascii="Times New Roman" w:hAnsi="Times New Roman" w:eastAsia="Times New Roman"/>
-                <w:b w:val="0"/>
-                <w:i w:val="0"/>
-                <w:sz w:val="24"/>
-              </w:rPr>
-              <w:t>Состояние при положительном решении</w:t>
-            </w:r>
-          </w:p>
-        </w:tc>
-      </w:tr>
-      <w:tr>
-        <w:tc>
-          <w:tcPr>
-            <w:tcW w:type="dxa" w:w="4844"/>
-          </w:tcPr>
-          <w:p>
-            <w:r/>
-            <w:r>
-              <w:rPr>
-                <w:rFonts w:ascii="Times New Roman" w:hAnsi="Times New Roman" w:eastAsia="Times New Roman"/>
-                <w:b w:val="0"/>
-                <w:i w:val="0"/>
-                <w:sz w:val="24"/>
-              </w:rPr>
-              <w:t>Если согласовано с замечаниями</w:t>
-            </w:r>
-          </w:p>
-        </w:tc>
-        <w:tc>
-          <w:tcPr>
-            <w:tcW w:type="dxa" w:w="4844"/>
-          </w:tcPr>
-          <w:p>
-            <w:r/>
-            <w:r>
-              <w:rPr>
-                <w:rFonts w:ascii="Times New Roman" w:hAnsi="Times New Roman" w:eastAsia="Times New Roman"/>
-                <w:b w:val="0"/>
-                <w:i w:val="0"/>
-                <w:sz w:val="24"/>
-              </w:rPr>
-              <w:t>Состояние при согласовании с замечаниями</w:t>
-            </w:r>
-          </w:p>
-        </w:tc>
-      </w:tr>
-      <w:tr>
-        <w:tc>
-          <w:tcPr>
-            <w:tcW w:type="dxa" w:w="4844"/>
-          </w:tcPr>
-          <w:p>
-            <w:r/>
-            <w:r>
-              <w:rPr>
-                <w:rFonts w:ascii="Times New Roman" w:hAnsi="Times New Roman" w:eastAsia="Times New Roman"/>
-                <w:b w:val="0"/>
-                <w:i w:val="0"/>
-                <w:sz w:val="24"/>
-              </w:rPr>
-              <w:t>Если отклонено</w:t>
-            </w:r>
-          </w:p>
-        </w:tc>
-        <w:tc>
-          <w:tcPr>
-            <w:tcW w:type="dxa" w:w="4844"/>
-          </w:tcPr>
-          <w:p>
-            <w:r/>
-            <w:r>
-              <w:rPr>
-                <w:rFonts w:ascii="Times New Roman" w:hAnsi="Times New Roman" w:eastAsia="Times New Roman"/>
-                <w:b w:val="0"/>
-                <w:i w:val="0"/>
-                <w:sz w:val="24"/>
-              </w:rPr>
-              <w:t>Состояние при отклонении</w:t>
-            </w:r>
-          </w:p>
-        </w:tc>
-      </w:tr>
-      <w:tr>
-        <w:tc>
-          <w:tcPr>
-            <w:tcW w:type="dxa" w:w="4844"/>
-          </w:tcPr>
-          <w:p>
-            <w:r/>
-            <w:r>
-              <w:rPr>
-                <w:rFonts w:ascii="Times New Roman" w:hAnsi="Times New Roman" w:eastAsia="Times New Roman"/>
-                <w:b w:val="0"/>
-                <w:i w:val="0"/>
-                <w:sz w:val="24"/>
-              </w:rPr>
-              <w:t>Статус при автоматическом закрытии</w:t>
-            </w:r>
-          </w:p>
-        </w:tc>
-        <w:tc>
-          <w:tcPr>
-            <w:tcW w:type="dxa" w:w="4844"/>
-          </w:tcPr>
-          <w:p>
-            <w:r/>
-            <w:r>
-              <w:rPr>
-                <w:rFonts w:ascii="Times New Roman" w:hAnsi="Times New Roman" w:eastAsia="Times New Roman"/>
-                <w:b w:val="0"/>
-                <w:i w:val="0"/>
-                <w:sz w:val="24"/>
-              </w:rPr>
-              <w:t>Состояние при автосогласовании</w:t>
-            </w:r>
-          </w:p>
-        </w:tc>
-      </w:tr>
-    </w:tbl>
-    <w:p/>
-    <w:p>
-      <w:pPr>
-        <w:pStyle w:val="Heading2"/>
-      </w:pPr>
-      <w:r>
-        <w:t>6.2. Согласующие лица</w:t>
+        <w:rPr>
+          <w:rFonts w:ascii="Times New Roman" w:hAnsi="Times New Roman" w:eastAsia="Times New Roman"/>
+          <w:b w:val="0"/>
+          <w:i w:val="0"/>
+          <w:sz w:val="28"/>
+        </w:rPr>
+        <w:t>Ключевые элементы формы:</w:t>
       </w:r>
     </w:p>
     <w:p>
@@ -2062,7 +923,7 @@
           <w:i w:val="0"/>
           <w:sz w:val="28"/>
         </w:rPr>
-        <w:t>«Добавить уровень» — последовательные этапы согласования;</w:t>
+        <w:t>«Срок согласования задачи (дней)» — при превышении возможно автосогласование (если настроено).</w:t>
       </w:r>
     </w:p>
     <w:p>
@@ -2077,7 +938,7 @@
           <w:i w:val="0"/>
           <w:sz w:val="28"/>
         </w:rPr>
-        <w:t>«Добавить физ. лицо» — согласующие на каждом уровне;</w:t>
+        <w:t>«Если согласовано / Если согласовано с замечаниями / Если отклонено» — какие состояния выставлять документу.</w:t>
       </w:r>
     </w:p>
     <w:p>
@@ -2092,7 +953,85 @@
           <w:i w:val="0"/>
           <w:sz w:val="28"/>
         </w:rPr>
-        <w:t>«Замещающие лица» — лица, имеющие право согласовать вместо основного.</w:t>
+        <w:t>Табличная часть «Согласующие лица» — уровни согласования и замещающие.</w:t>
+      </w:r>
+    </w:p>
+    <w:p>
+      <w:pPr>
+        <w:pStyle w:val="Heading1"/>
+      </w:pPr>
+      <w:r>
+        <w:t>6. Справочник «Типы изменений»</w:t>
+      </w:r>
+    </w:p>
+    <w:p>
+      <w:r>
+        <w:rPr>
+          <w:rFonts w:ascii="Times New Roman" w:hAnsi="Times New Roman" w:eastAsia="Times New Roman"/>
+          <w:b w:val="0"/>
+          <w:i w:val="0"/>
+          <w:sz w:val="28"/>
+        </w:rPr>
+        <w:t>Тип изменения выбирается в документе «Изменение» и определяет, какие комитеты могут согласовывать изменение данного типа.</w:t>
+      </w:r>
+    </w:p>
+    <w:p>
+      <w:pPr>
+        <w:ind w:firstLine="0"/>
+      </w:pPr>
+      <w:r>
+        <w:rPr>
+          <w:rFonts w:ascii="Times New Roman" w:hAnsi="Times New Roman" w:eastAsia="Times New Roman"/>
+          <w:b w:val="0"/>
+          <w:i w:val="0"/>
+          <w:sz w:val="28"/>
+        </w:rPr>
+        <w:t>Рекомендуемые типы:</w:t>
+      </w:r>
+    </w:p>
+    <w:p>
+      <w:pPr>
+        <w:pStyle w:val="ListBullet"/>
+        <w:ind w:firstLine="0" w:left="709"/>
+      </w:pPr>
+      <w:r>
+        <w:rPr>
+          <w:rFonts w:ascii="Times New Roman" w:hAnsi="Times New Roman" w:eastAsia="Times New Roman"/>
+          <w:b w:val="0"/>
+          <w:i w:val="0"/>
+          <w:sz w:val="28"/>
+        </w:rPr>
+        <w:t>Стандартное (плановое) — проходит полное согласование.</w:t>
+      </w:r>
+    </w:p>
+    <w:p>
+      <w:pPr>
+        <w:pStyle w:val="ListBullet"/>
+        <w:ind w:firstLine="0" w:left="709"/>
+      </w:pPr>
+      <w:r>
+        <w:rPr>
+          <w:rFonts w:ascii="Times New Roman" w:hAnsi="Times New Roman" w:eastAsia="Times New Roman"/>
+          <w:b w:val="0"/>
+          <w:i w:val="0"/>
+          <w:sz w:val="28"/>
+        </w:rPr>
+        <w:t>Срочное — ускоренное согласование.</w:t>
+      </w:r>
+    </w:p>
+    <w:p>
+      <w:pPr>
+        <w:pStyle w:val="ListBullet"/>
+        <w:ind w:firstLine="0" w:left="709"/>
+      </w:pPr>
+      <w:r>
+        <w:rPr>
+          <w:rFonts w:ascii="Times New Roman" w:hAnsi="Times New Roman" w:eastAsia="Times New Roman"/>
+          <w:b w:val="0"/>
+          <w:i w:val="0"/>
+          <w:sz w:val="28"/>
+        </w:rPr>
+        <w:t>Экстренное — минимально необходимое согласование.</w:t>
       </w:r>
     </w:p>
     <w:p>
@@ -2111,1463 +1050,7 @@
           <w:i w:val="0"/>
           <w:sz w:val="28"/>
         </w:rPr>
-        <w:t>Справочник хранит коды закрытия для аналитики результатов работы над изменением.</w:t>
-      </w:r>
-    </w:p>
-    <w:tbl>
-      <w:tblPr>
-        <w:tblStyle w:val="TableGrid"/>
-        <w:tblW w:type="auto" w:w="0"/>
-        <w:tblLook w:firstColumn="1" w:firstRow="1" w:lastColumn="0" w:lastRow="0" w:noHBand="0" w:noVBand="1" w:val="04A0"/>
-      </w:tblPr>
-      <w:tblGrid>
-        <w:gridCol w:w="4844"/>
-        <w:gridCol w:w="4844"/>
-      </w:tblGrid>
-      <w:tr>
-        <w:tc>
-          <w:tcPr>
-            <w:tcW w:type="dxa" w:w="4844"/>
-            <w:shd w:fill="003366"/>
-          </w:tcPr>
-          <w:p>
-            <w:pPr>
-              <w:jc w:val="center"/>
-            </w:pPr>
-            <w:r/>
-            <w:r>
-              <w:rPr>
-                <w:rFonts w:ascii="Times New Roman" w:hAnsi="Times New Roman" w:eastAsia="Times New Roman"/>
-                <w:b/>
-                <w:i w:val="0"/>
-                <w:color w:val="FFFFFF"/>
-                <w:sz w:val="24"/>
-              </w:rPr>
-              <w:t>Поле</w:t>
-            </w:r>
-          </w:p>
-        </w:tc>
-        <w:tc>
-          <w:tcPr>
-            <w:tcW w:type="dxa" w:w="4844"/>
-            <w:shd w:fill="003366"/>
-          </w:tcPr>
-          <w:p>
-            <w:pPr>
-              <w:jc w:val="center"/>
-            </w:pPr>
-            <w:r/>
-            <w:r>
-              <w:rPr>
-                <w:rFonts w:ascii="Times New Roman" w:hAnsi="Times New Roman" w:eastAsia="Times New Roman"/>
-                <w:b/>
-                <w:i w:val="0"/>
-                <w:color w:val="FFFFFF"/>
-                <w:sz w:val="24"/>
-              </w:rPr>
-              <w:t>Описание</w:t>
-            </w:r>
-          </w:p>
-        </w:tc>
-      </w:tr>
-      <w:tr>
-        <w:tc>
-          <w:tcPr>
-            <w:tcW w:type="dxa" w:w="4844"/>
-          </w:tcPr>
-          <w:p>
-            <w:r/>
-            <w:r>
-              <w:rPr>
-                <w:rFonts w:ascii="Times New Roman" w:hAnsi="Times New Roman" w:eastAsia="Times New Roman"/>
-                <w:b w:val="0"/>
-                <w:i w:val="0"/>
-                <w:sz w:val="24"/>
-              </w:rPr>
-              <w:t>Код</w:t>
-            </w:r>
-          </w:p>
-        </w:tc>
-        <w:tc>
-          <w:tcPr>
-            <w:tcW w:type="dxa" w:w="4844"/>
-          </w:tcPr>
-          <w:p>
-            <w:r/>
-            <w:r>
-              <w:rPr>
-                <w:rFonts w:ascii="Times New Roman" w:hAnsi="Times New Roman" w:eastAsia="Times New Roman"/>
-                <w:b w:val="0"/>
-                <w:i w:val="0"/>
-                <w:sz w:val="24"/>
-              </w:rPr>
-              <w:t>Системный код</w:t>
-            </w:r>
-          </w:p>
-        </w:tc>
-      </w:tr>
-      <w:tr>
-        <w:tc>
-          <w:tcPr>
-            <w:tcW w:type="dxa" w:w="4844"/>
-          </w:tcPr>
-          <w:p>
-            <w:r/>
-            <w:r>
-              <w:rPr>
-                <w:rFonts w:ascii="Times New Roman" w:hAnsi="Times New Roman" w:eastAsia="Times New Roman"/>
-                <w:b w:val="0"/>
-                <w:i w:val="0"/>
-                <w:sz w:val="24"/>
-              </w:rPr>
-              <w:t>Наименование</w:t>
-            </w:r>
-          </w:p>
-        </w:tc>
-        <w:tc>
-          <w:tcPr>
-            <w:tcW w:type="dxa" w:w="4844"/>
-          </w:tcPr>
-          <w:p>
-            <w:r/>
-            <w:r>
-              <w:rPr>
-                <w:rFonts w:ascii="Times New Roman" w:hAnsi="Times New Roman" w:eastAsia="Times New Roman"/>
-                <w:b w:val="0"/>
-                <w:i w:val="0"/>
-                <w:sz w:val="24"/>
-              </w:rPr>
-              <w:t>Отображаемое название</w:t>
-            </w:r>
-          </w:p>
-        </w:tc>
-      </w:tr>
-      <w:tr>
-        <w:tc>
-          <w:tcPr>
-            <w:tcW w:type="dxa" w:w="4844"/>
-          </w:tcPr>
-          <w:p>
-            <w:r/>
-            <w:r>
-              <w:rPr>
-                <w:rFonts w:ascii="Times New Roman" w:hAnsi="Times New Roman" w:eastAsia="Times New Roman"/>
-                <w:b w:val="0"/>
-                <w:i w:val="0"/>
-                <w:sz w:val="24"/>
-              </w:rPr>
-              <w:t>Описание</w:t>
-            </w:r>
-          </w:p>
-        </w:tc>
-        <w:tc>
-          <w:tcPr>
-            <w:tcW w:type="dxa" w:w="4844"/>
-          </w:tcPr>
-          <w:p>
-            <w:r/>
-            <w:r>
-              <w:rPr>
-                <w:rFonts w:ascii="Times New Roman" w:hAnsi="Times New Roman" w:eastAsia="Times New Roman"/>
-                <w:b w:val="0"/>
-                <w:i w:val="0"/>
-                <w:sz w:val="24"/>
-              </w:rPr>
-              <w:t>Подробное описание</w:t>
-            </w:r>
-          </w:p>
-        </w:tc>
-      </w:tr>
-    </w:tbl>
-    <w:p/>
-    <w:p>
-      <w:pPr>
-        <w:ind w:firstLine="0"/>
-      </w:pPr>
-      <w:r>
-        <w:rPr>
-          <w:rFonts w:ascii="Times New Roman" w:hAnsi="Times New Roman" w:eastAsia="Times New Roman"/>
-          <w:b/>
-          <w:i w:val="0"/>
-          <w:sz w:val="28"/>
-        </w:rPr>
-        <w:t>Примеры значений:</w:t>
-      </w:r>
-    </w:p>
-    <w:tbl>
-      <w:tblPr>
-        <w:tblStyle w:val="TableGrid"/>
-        <w:tblW w:type="auto" w:w="0"/>
-        <w:tblLook w:firstColumn="1" w:firstRow="1" w:lastColumn="0" w:lastRow="0" w:noHBand="0" w:noVBand="1" w:val="04A0"/>
-      </w:tblPr>
-      <w:tblGrid>
-        <w:gridCol w:w="4844"/>
-        <w:gridCol w:w="4844"/>
-      </w:tblGrid>
-      <w:tr>
-        <w:tc>
-          <w:tcPr>
-            <w:tcW w:type="dxa" w:w="4844"/>
-            <w:shd w:fill="003366"/>
-          </w:tcPr>
-          <w:p>
-            <w:pPr>
-              <w:jc w:val="center"/>
-            </w:pPr>
-            <w:r/>
-            <w:r>
-              <w:rPr>
-                <w:rFonts w:ascii="Times New Roman" w:hAnsi="Times New Roman" w:eastAsia="Times New Roman"/>
-                <w:b/>
-                <w:i w:val="0"/>
-                <w:color w:val="FFFFFF"/>
-                <w:sz w:val="24"/>
-              </w:rPr>
-              <w:t>Код</w:t>
-            </w:r>
-          </w:p>
-        </w:tc>
-        <w:tc>
-          <w:tcPr>
-            <w:tcW w:type="dxa" w:w="4844"/>
-            <w:shd w:fill="003366"/>
-          </w:tcPr>
-          <w:p>
-            <w:pPr>
-              <w:jc w:val="center"/>
-            </w:pPr>
-            <w:r/>
-            <w:r>
-              <w:rPr>
-                <w:rFonts w:ascii="Times New Roman" w:hAnsi="Times New Roman" w:eastAsia="Times New Roman"/>
-                <w:b/>
-                <w:i w:val="0"/>
-                <w:color w:val="FFFFFF"/>
-                <w:sz w:val="24"/>
-              </w:rPr>
-              <w:t>Наименование</w:t>
-            </w:r>
-          </w:p>
-        </w:tc>
-      </w:tr>
-      <w:tr>
-        <w:tc>
-          <w:tcPr>
-            <w:tcW w:type="dxa" w:w="4844"/>
-          </w:tcPr>
-          <w:p>
-            <w:r/>
-            <w:r>
-              <w:rPr>
-                <w:rFonts w:ascii="Times New Roman" w:hAnsi="Times New Roman" w:eastAsia="Times New Roman"/>
-                <w:b w:val="0"/>
-                <w:i w:val="0"/>
-                <w:sz w:val="24"/>
-              </w:rPr>
-              <w:t>001</w:t>
-            </w:r>
-          </w:p>
-        </w:tc>
-        <w:tc>
-          <w:tcPr>
-            <w:tcW w:type="dxa" w:w="4844"/>
-          </w:tcPr>
-          <w:p>
-            <w:r/>
-            <w:r>
-              <w:rPr>
-                <w:rFonts w:ascii="Times New Roman" w:hAnsi="Times New Roman" w:eastAsia="Times New Roman"/>
-                <w:b w:val="0"/>
-                <w:i w:val="0"/>
-                <w:sz w:val="24"/>
-              </w:rPr>
-              <w:t>Закрыто успешно</w:t>
-            </w:r>
-          </w:p>
-        </w:tc>
-      </w:tr>
-      <w:tr>
-        <w:tc>
-          <w:tcPr>
-            <w:tcW w:type="dxa" w:w="4844"/>
-          </w:tcPr>
-          <w:p>
-            <w:r/>
-            <w:r>
-              <w:rPr>
-                <w:rFonts w:ascii="Times New Roman" w:hAnsi="Times New Roman" w:eastAsia="Times New Roman"/>
-                <w:b w:val="0"/>
-                <w:i w:val="0"/>
-                <w:sz w:val="24"/>
-              </w:rPr>
-              <w:t>002</w:t>
-            </w:r>
-          </w:p>
-        </w:tc>
-        <w:tc>
-          <w:tcPr>
-            <w:tcW w:type="dxa" w:w="4844"/>
-          </w:tcPr>
-          <w:p>
-            <w:r/>
-            <w:r>
-              <w:rPr>
-                <w:rFonts w:ascii="Times New Roman" w:hAnsi="Times New Roman" w:eastAsia="Times New Roman"/>
-                <w:b w:val="0"/>
-                <w:i w:val="0"/>
-                <w:sz w:val="24"/>
-              </w:rPr>
-              <w:t>Закрыто с отклонением от плана</w:t>
-            </w:r>
-          </w:p>
-        </w:tc>
-      </w:tr>
-      <w:tr>
-        <w:tc>
-          <w:tcPr>
-            <w:tcW w:type="dxa" w:w="4844"/>
-          </w:tcPr>
-          <w:p>
-            <w:r/>
-            <w:r>
-              <w:rPr>
-                <w:rFonts w:ascii="Times New Roman" w:hAnsi="Times New Roman" w:eastAsia="Times New Roman"/>
-                <w:b w:val="0"/>
-                <w:i w:val="0"/>
-                <w:sz w:val="24"/>
-              </w:rPr>
-              <w:t>003</w:t>
-            </w:r>
-          </w:p>
-        </w:tc>
-        <w:tc>
-          <w:tcPr>
-            <w:tcW w:type="dxa" w:w="4844"/>
-          </w:tcPr>
-          <w:p>
-            <w:r/>
-            <w:r>
-              <w:rPr>
-                <w:rFonts w:ascii="Times New Roman" w:hAnsi="Times New Roman" w:eastAsia="Times New Roman"/>
-                <w:b w:val="0"/>
-                <w:i w:val="0"/>
-                <w:sz w:val="24"/>
-              </w:rPr>
-              <w:t>Отменено инициатором</w:t>
-            </w:r>
-          </w:p>
-        </w:tc>
-      </w:tr>
-      <w:tr>
-        <w:tc>
-          <w:tcPr>
-            <w:tcW w:type="dxa" w:w="4844"/>
-          </w:tcPr>
-          <w:p>
-            <w:r/>
-            <w:r>
-              <w:rPr>
-                <w:rFonts w:ascii="Times New Roman" w:hAnsi="Times New Roman" w:eastAsia="Times New Roman"/>
-                <w:b w:val="0"/>
-                <w:i w:val="0"/>
-                <w:sz w:val="24"/>
-              </w:rPr>
-              <w:t>004</w:t>
-            </w:r>
-          </w:p>
-        </w:tc>
-        <w:tc>
-          <w:tcPr>
-            <w:tcW w:type="dxa" w:w="4844"/>
-          </w:tcPr>
-          <w:p>
-            <w:r/>
-            <w:r>
-              <w:rPr>
-                <w:rFonts w:ascii="Times New Roman" w:hAnsi="Times New Roman" w:eastAsia="Times New Roman"/>
-                <w:b w:val="0"/>
-                <w:i w:val="0"/>
-                <w:sz w:val="24"/>
-              </w:rPr>
-              <w:t>Закрыто по истечении срока</w:t>
-            </w:r>
-          </w:p>
-        </w:tc>
-      </w:tr>
-      <w:tr>
-        <w:tc>
-          <w:tcPr>
-            <w:tcW w:type="dxa" w:w="4844"/>
-          </w:tcPr>
-          <w:p>
-            <w:r/>
-            <w:r>
-              <w:rPr>
-                <w:rFonts w:ascii="Times New Roman" w:hAnsi="Times New Roman" w:eastAsia="Times New Roman"/>
-                <w:b w:val="0"/>
-                <w:i w:val="0"/>
-                <w:sz w:val="24"/>
-              </w:rPr>
-              <w:t>005</w:t>
-            </w:r>
-          </w:p>
-        </w:tc>
-        <w:tc>
-          <w:tcPr>
-            <w:tcW w:type="dxa" w:w="4844"/>
-          </w:tcPr>
-          <w:p>
-            <w:r/>
-            <w:r>
-              <w:rPr>
-                <w:rFonts w:ascii="Times New Roman" w:hAnsi="Times New Roman" w:eastAsia="Times New Roman"/>
-                <w:b w:val="0"/>
-                <w:i w:val="0"/>
-                <w:sz w:val="24"/>
-              </w:rPr>
-              <w:t>Не реализовано — нет ресурсов</w:t>
-            </w:r>
-          </w:p>
-        </w:tc>
-      </w:tr>
-    </w:tbl>
-    <w:p/>
-    <w:p>
-      <w:pPr>
-        <w:pStyle w:val="Heading1"/>
-      </w:pPr>
-      <w:r>
-        <w:t>8. Связанные общие справочники</w:t>
-      </w:r>
-    </w:p>
-    <w:p>
-      <w:pPr>
-        <w:pStyle w:val="Heading2"/>
-      </w:pPr>
-      <w:r>
-        <w:t>8.1. Категории документов</w:t>
-      </w:r>
-    </w:p>
-    <w:p>
-      <w:r>
-        <w:rPr>
-          <w:rFonts w:ascii="Times New Roman" w:hAnsi="Times New Roman" w:eastAsia="Times New Roman"/>
-          <w:b w:val="0"/>
-          <w:i w:val="0"/>
-          <w:sz w:val="28"/>
-        </w:rPr>
-        <w:t>Путь: раздел «Управление изменениями» → Категории документов. Используется для уточняющей аналитики (например: «простое», «среднее», «большое»). Справочник многоуровневый.</w:t>
-      </w:r>
-    </w:p>
-    <w:p>
-      <w:pPr>
-        <w:pStyle w:val="Heading2"/>
-      </w:pPr>
-      <w:r>
-        <w:t>8.2. Приоритеты</w:t>
-      </w:r>
-    </w:p>
-    <w:p>
-      <w:r>
-        <w:rPr>
-          <w:rFonts w:ascii="Times New Roman" w:hAnsi="Times New Roman" w:eastAsia="Times New Roman"/>
-          <w:b w:val="0"/>
-          <w:i w:val="0"/>
-          <w:sz w:val="28"/>
-        </w:rPr>
-        <w:t>Путь: «Функции для технического специалиста» → Приоритеты. Определяет порядок обработки. Рекомендуется префикс: 1_Высокий, 2_Средний, 3_Низкий.</w:t>
-      </w:r>
-    </w:p>
-    <w:p>
-      <w:pPr>
-        <w:pStyle w:val="Heading1"/>
-      </w:pPr>
-      <w:r>
-        <w:t>9. Документ «Изменение»</w:t>
-      </w:r>
-    </w:p>
-    <w:p>
-      <w:r>
-        <w:rPr>
-          <w:rFonts w:ascii="Times New Roman" w:hAnsi="Times New Roman" w:eastAsia="Times New Roman"/>
-          <w:b w:val="0"/>
-          <w:i w:val="0"/>
-          <w:sz w:val="28"/>
-        </w:rPr>
-        <w:t>Основной объект учёта процесса. Отвечает за процедуру внесения изменений в конфигурационную базу данных, оборудование, ПО, документацию и ИТ-сервисы.</w:t>
-      </w:r>
-    </w:p>
-    <w:p>
-      <w:pPr>
-        <w:pStyle w:val="Heading2"/>
-      </w:pPr>
-      <w:r>
-        <w:t>9.1. Основные реквизиты</w:t>
-      </w:r>
-    </w:p>
-    <w:tbl>
-      <w:tblPr>
-        <w:tblStyle w:val="TableGrid"/>
-        <w:tblW w:type="auto" w:w="0"/>
-        <w:tblLook w:firstColumn="1" w:firstRow="1" w:lastColumn="0" w:lastRow="0" w:noHBand="0" w:noVBand="1" w:val="04A0"/>
-      </w:tblPr>
-      <w:tblGrid>
-        <w:gridCol w:w="4844"/>
-        <w:gridCol w:w="4844"/>
-      </w:tblGrid>
-      <w:tr>
-        <w:tc>
-          <w:tcPr>
-            <w:tcW w:type="dxa" w:w="4844"/>
-            <w:shd w:fill="003366"/>
-          </w:tcPr>
-          <w:p>
-            <w:pPr>
-              <w:jc w:val="center"/>
-            </w:pPr>
-            <w:r/>
-            <w:r>
-              <w:rPr>
-                <w:rFonts w:ascii="Times New Roman" w:hAnsi="Times New Roman" w:eastAsia="Times New Roman"/>
-                <w:b/>
-                <w:i w:val="0"/>
-                <w:color w:val="FFFFFF"/>
-                <w:sz w:val="24"/>
-              </w:rPr>
-              <w:t>Поле</w:t>
-            </w:r>
-          </w:p>
-        </w:tc>
-        <w:tc>
-          <w:tcPr>
-            <w:tcW w:type="dxa" w:w="4844"/>
-            <w:shd w:fill="003366"/>
-          </w:tcPr>
-          <w:p>
-            <w:pPr>
-              <w:jc w:val="center"/>
-            </w:pPr>
-            <w:r/>
-            <w:r>
-              <w:rPr>
-                <w:rFonts w:ascii="Times New Roman" w:hAnsi="Times New Roman" w:eastAsia="Times New Roman"/>
-                <w:b/>
-                <w:i w:val="0"/>
-                <w:color w:val="FFFFFF"/>
-                <w:sz w:val="24"/>
-              </w:rPr>
-              <w:t>Источник / описание</w:t>
-            </w:r>
-          </w:p>
-        </w:tc>
-      </w:tr>
-      <w:tr>
-        <w:tc>
-          <w:tcPr>
-            <w:tcW w:type="dxa" w:w="4844"/>
-          </w:tcPr>
-          <w:p>
-            <w:r/>
-            <w:r>
-              <w:rPr>
-                <w:rFonts w:ascii="Times New Roman" w:hAnsi="Times New Roman" w:eastAsia="Times New Roman"/>
-                <w:b w:val="0"/>
-                <w:i w:val="0"/>
-                <w:sz w:val="24"/>
-              </w:rPr>
-              <w:t>Номер, Дата</w:t>
-            </w:r>
-          </w:p>
-        </w:tc>
-        <w:tc>
-          <w:tcPr>
-            <w:tcW w:type="dxa" w:w="4844"/>
-          </w:tcPr>
-          <w:p>
-            <w:r/>
-            <w:r>
-              <w:rPr>
-                <w:rFonts w:ascii="Times New Roman" w:hAnsi="Times New Roman" w:eastAsia="Times New Roman"/>
-                <w:b w:val="0"/>
-                <w:i w:val="0"/>
-                <w:sz w:val="24"/>
-              </w:rPr>
-              <w:t>Системные реквизиты</w:t>
-            </w:r>
-          </w:p>
-        </w:tc>
-      </w:tr>
-      <w:tr>
-        <w:tc>
-          <w:tcPr>
-            <w:tcW w:type="dxa" w:w="4844"/>
-          </w:tcPr>
-          <w:p>
-            <w:r/>
-            <w:r>
-              <w:rPr>
-                <w:rFonts w:ascii="Times New Roman" w:hAnsi="Times New Roman" w:eastAsia="Times New Roman"/>
-                <w:b w:val="0"/>
-                <w:i w:val="0"/>
-                <w:sz w:val="24"/>
-              </w:rPr>
-              <w:t>Клиент</w:t>
-            </w:r>
-          </w:p>
-        </w:tc>
-        <w:tc>
-          <w:tcPr>
-            <w:tcW w:type="dxa" w:w="4844"/>
-          </w:tcPr>
-          <w:p>
-            <w:r/>
-            <w:r>
-              <w:rPr>
-                <w:rFonts w:ascii="Times New Roman" w:hAnsi="Times New Roman" w:eastAsia="Times New Roman"/>
-                <w:b w:val="0"/>
-                <w:i w:val="0"/>
-                <w:sz w:val="24"/>
-              </w:rPr>
-              <w:t>Справочник «Клиенты»</w:t>
-            </w:r>
-          </w:p>
-        </w:tc>
-      </w:tr>
-      <w:tr>
-        <w:tc>
-          <w:tcPr>
-            <w:tcW w:type="dxa" w:w="4844"/>
-          </w:tcPr>
-          <w:p>
-            <w:r/>
-            <w:r>
-              <w:rPr>
-                <w:rFonts w:ascii="Times New Roman" w:hAnsi="Times New Roman" w:eastAsia="Times New Roman"/>
-                <w:b w:val="0"/>
-                <w:i w:val="0"/>
-                <w:sz w:val="24"/>
-              </w:rPr>
-              <w:t>Инициатор</w:t>
-            </w:r>
-          </w:p>
-        </w:tc>
-        <w:tc>
-          <w:tcPr>
-            <w:tcW w:type="dxa" w:w="4844"/>
-          </w:tcPr>
-          <w:p>
-            <w:r/>
-            <w:r>
-              <w:rPr>
-                <w:rFonts w:ascii="Times New Roman" w:hAnsi="Times New Roman" w:eastAsia="Times New Roman"/>
-                <w:b w:val="0"/>
-                <w:i w:val="0"/>
-                <w:sz w:val="24"/>
-              </w:rPr>
-              <w:t>Сотрудник, инициировавший изменение</w:t>
-            </w:r>
-          </w:p>
-        </w:tc>
-      </w:tr>
-      <w:tr>
-        <w:tc>
-          <w:tcPr>
-            <w:tcW w:type="dxa" w:w="4844"/>
-          </w:tcPr>
-          <w:p>
-            <w:r/>
-            <w:r>
-              <w:rPr>
-                <w:rFonts w:ascii="Times New Roman" w:hAnsi="Times New Roman" w:eastAsia="Times New Roman"/>
-                <w:b w:val="0"/>
-                <w:i w:val="0"/>
-                <w:sz w:val="24"/>
-              </w:rPr>
-              <w:t>Описание</w:t>
-            </w:r>
-          </w:p>
-        </w:tc>
-        <w:tc>
-          <w:tcPr>
-            <w:tcW w:type="dxa" w:w="4844"/>
-          </w:tcPr>
-          <w:p>
-            <w:r/>
-            <w:r>
-              <w:rPr>
-                <w:rFonts w:ascii="Times New Roman" w:hAnsi="Times New Roman" w:eastAsia="Times New Roman"/>
-                <w:b w:val="0"/>
-                <w:i w:val="0"/>
-                <w:sz w:val="24"/>
-              </w:rPr>
-              <w:t>Текстовое описание изменения</w:t>
-            </w:r>
-          </w:p>
-        </w:tc>
-      </w:tr>
-      <w:tr>
-        <w:tc>
-          <w:tcPr>
-            <w:tcW w:type="dxa" w:w="4844"/>
-          </w:tcPr>
-          <w:p>
-            <w:r/>
-            <w:r>
-              <w:rPr>
-                <w:rFonts w:ascii="Times New Roman" w:hAnsi="Times New Roman" w:eastAsia="Times New Roman"/>
-                <w:b w:val="0"/>
-                <w:i w:val="0"/>
-                <w:sz w:val="24"/>
-              </w:rPr>
-              <w:t>Тип</w:t>
-            </w:r>
-          </w:p>
-        </w:tc>
-        <w:tc>
-          <w:tcPr>
-            <w:tcW w:type="dxa" w:w="4844"/>
-          </w:tcPr>
-          <w:p>
-            <w:r/>
-            <w:r>
-              <w:rPr>
-                <w:rFonts w:ascii="Times New Roman" w:hAnsi="Times New Roman" w:eastAsia="Times New Roman"/>
-                <w:b w:val="0"/>
-                <w:i w:val="0"/>
-                <w:sz w:val="24"/>
-              </w:rPr>
-              <w:t>Справочник «Типы изменений»</w:t>
-            </w:r>
-          </w:p>
-        </w:tc>
-      </w:tr>
-      <w:tr>
-        <w:tc>
-          <w:tcPr>
-            <w:tcW w:type="dxa" w:w="4844"/>
-          </w:tcPr>
-          <w:p>
-            <w:r/>
-            <w:r>
-              <w:rPr>
-                <w:rFonts w:ascii="Times New Roman" w:hAnsi="Times New Roman" w:eastAsia="Times New Roman"/>
-                <w:b w:val="0"/>
-                <w:i w:val="0"/>
-                <w:sz w:val="24"/>
-              </w:rPr>
-              <w:t>Категория</w:t>
-            </w:r>
-          </w:p>
-        </w:tc>
-        <w:tc>
-          <w:tcPr>
-            <w:tcW w:type="dxa" w:w="4844"/>
-          </w:tcPr>
-          <w:p>
-            <w:r/>
-            <w:r>
-              <w:rPr>
-                <w:rFonts w:ascii="Times New Roman" w:hAnsi="Times New Roman" w:eastAsia="Times New Roman"/>
-                <w:b w:val="0"/>
-                <w:i w:val="0"/>
-                <w:sz w:val="24"/>
-              </w:rPr>
-              <w:t>Справочник «Категории документов»</w:t>
-            </w:r>
-          </w:p>
-        </w:tc>
-      </w:tr>
-      <w:tr>
-        <w:tc>
-          <w:tcPr>
-            <w:tcW w:type="dxa" w:w="4844"/>
-          </w:tcPr>
-          <w:p>
-            <w:r/>
-            <w:r>
-              <w:rPr>
-                <w:rFonts w:ascii="Times New Roman" w:hAnsi="Times New Roman" w:eastAsia="Times New Roman"/>
-                <w:b w:val="0"/>
-                <w:i w:val="0"/>
-                <w:sz w:val="24"/>
-              </w:rPr>
-              <w:t>Приоритет</w:t>
-            </w:r>
-          </w:p>
-        </w:tc>
-        <w:tc>
-          <w:tcPr>
-            <w:tcW w:type="dxa" w:w="4844"/>
-          </w:tcPr>
-          <w:p>
-            <w:r/>
-            <w:r>
-              <w:rPr>
-                <w:rFonts w:ascii="Times New Roman" w:hAnsi="Times New Roman" w:eastAsia="Times New Roman"/>
-                <w:b w:val="0"/>
-                <w:i w:val="0"/>
-                <w:sz w:val="24"/>
-              </w:rPr>
-              <w:t>Справочник «Приоритеты»</w:t>
-            </w:r>
-          </w:p>
-        </w:tc>
-      </w:tr>
-      <w:tr>
-        <w:tc>
-          <w:tcPr>
-            <w:tcW w:type="dxa" w:w="4844"/>
-          </w:tcPr>
-          <w:p>
-            <w:r/>
-            <w:r>
-              <w:rPr>
-                <w:rFonts w:ascii="Times New Roman" w:hAnsi="Times New Roman" w:eastAsia="Times New Roman"/>
-                <w:b w:val="0"/>
-                <w:i w:val="0"/>
-                <w:sz w:val="24"/>
-              </w:rPr>
-              <w:t>Состояние</w:t>
-            </w:r>
-          </w:p>
-        </w:tc>
-        <w:tc>
-          <w:tcPr>
-            <w:tcW w:type="dxa" w:w="4844"/>
-          </w:tcPr>
-          <w:p>
-            <w:r/>
-            <w:r>
-              <w:rPr>
-                <w:rFonts w:ascii="Times New Roman" w:hAnsi="Times New Roman" w:eastAsia="Times New Roman"/>
-                <w:b w:val="0"/>
-                <w:i w:val="0"/>
-                <w:sz w:val="24"/>
-              </w:rPr>
-              <w:t>Справочник «Состояния изменений»</w:t>
-            </w:r>
-          </w:p>
-        </w:tc>
-      </w:tr>
-      <w:tr>
-        <w:tc>
-          <w:tcPr>
-            <w:tcW w:type="dxa" w:w="4844"/>
-          </w:tcPr>
-          <w:p>
-            <w:r/>
-            <w:r>
-              <w:rPr>
-                <w:rFonts w:ascii="Times New Roman" w:hAnsi="Times New Roman" w:eastAsia="Times New Roman"/>
-                <w:b w:val="0"/>
-                <w:i w:val="0"/>
-                <w:sz w:val="24"/>
-              </w:rPr>
-              <w:t>Код закрытия</w:t>
-            </w:r>
-          </w:p>
-        </w:tc>
-        <w:tc>
-          <w:tcPr>
-            <w:tcW w:type="dxa" w:w="4844"/>
-          </w:tcPr>
-          <w:p>
-            <w:r/>
-            <w:r>
-              <w:rPr>
-                <w:rFonts w:ascii="Times New Roman" w:hAnsi="Times New Roman" w:eastAsia="Times New Roman"/>
-                <w:b w:val="0"/>
-                <w:i w:val="0"/>
-                <w:sz w:val="24"/>
-              </w:rPr>
-              <w:t>Справочник «Коды закрытия изменений»</w:t>
-            </w:r>
-          </w:p>
-        </w:tc>
-      </w:tr>
-      <w:tr>
-        <w:tc>
-          <w:tcPr>
-            <w:tcW w:type="dxa" w:w="4844"/>
-          </w:tcPr>
-          <w:p>
-            <w:r/>
-            <w:r>
-              <w:rPr>
-                <w:rFonts w:ascii="Times New Roman" w:hAnsi="Times New Roman" w:eastAsia="Times New Roman"/>
-                <w:b w:val="0"/>
-                <w:i w:val="0"/>
-                <w:sz w:val="24"/>
-              </w:rPr>
-              <w:t>Ответственный</w:t>
-            </w:r>
-          </w:p>
-        </w:tc>
-        <w:tc>
-          <w:tcPr>
-            <w:tcW w:type="dxa" w:w="4844"/>
-          </w:tcPr>
-          <w:p>
-            <w:r/>
-            <w:r>
-              <w:rPr>
-                <w:rFonts w:ascii="Times New Roman" w:hAnsi="Times New Roman" w:eastAsia="Times New Roman"/>
-                <w:b w:val="0"/>
-                <w:i w:val="0"/>
-                <w:sz w:val="24"/>
-              </w:rPr>
-              <w:t>«Сотрудники» или «Рабочие группы»</w:t>
-            </w:r>
-          </w:p>
-        </w:tc>
-      </w:tr>
-    </w:tbl>
-    <w:p/>
-    <w:p>
-      <w:pPr>
-        <w:pStyle w:val="Heading2"/>
-      </w:pPr>
-      <w:r>
-        <w:t>9.2. Вкладки документа</w:t>
-      </w:r>
-    </w:p>
-    <w:tbl>
-      <w:tblPr>
-        <w:tblStyle w:val="TableGrid"/>
-        <w:tblW w:type="auto" w:w="0"/>
-        <w:tblLook w:firstColumn="1" w:firstRow="1" w:lastColumn="0" w:lastRow="0" w:noHBand="0" w:noVBand="1" w:val="04A0"/>
-      </w:tblPr>
-      <w:tblGrid>
-        <w:gridCol w:w="4844"/>
-        <w:gridCol w:w="4844"/>
-      </w:tblGrid>
-      <w:tr>
-        <w:tc>
-          <w:tcPr>
-            <w:tcW w:type="dxa" w:w="4844"/>
-            <w:shd w:fill="003366"/>
-          </w:tcPr>
-          <w:p>
-            <w:pPr>
-              <w:jc w:val="center"/>
-            </w:pPr>
-            <w:r/>
-            <w:r>
-              <w:rPr>
-                <w:rFonts w:ascii="Times New Roman" w:hAnsi="Times New Roman" w:eastAsia="Times New Roman"/>
-                <w:b/>
-                <w:i w:val="0"/>
-                <w:color w:val="FFFFFF"/>
-                <w:sz w:val="24"/>
-              </w:rPr>
-              <w:t>Вкладка</w:t>
-            </w:r>
-          </w:p>
-        </w:tc>
-        <w:tc>
-          <w:tcPr>
-            <w:tcW w:type="dxa" w:w="4844"/>
-            <w:shd w:fill="003366"/>
-          </w:tcPr>
-          <w:p>
-            <w:pPr>
-              <w:jc w:val="center"/>
-            </w:pPr>
-            <w:r/>
-            <w:r>
-              <w:rPr>
-                <w:rFonts w:ascii="Times New Roman" w:hAnsi="Times New Roman" w:eastAsia="Times New Roman"/>
-                <w:b/>
-                <w:i w:val="0"/>
-                <w:color w:val="FFFFFF"/>
-                <w:sz w:val="24"/>
-              </w:rPr>
-              <w:t>Содержание</w:t>
-            </w:r>
-          </w:p>
-        </w:tc>
-      </w:tr>
-      <w:tr>
-        <w:tc>
-          <w:tcPr>
-            <w:tcW w:type="dxa" w:w="4844"/>
-          </w:tcPr>
-          <w:p>
-            <w:r/>
-            <w:r>
-              <w:rPr>
-                <w:rFonts w:ascii="Times New Roman" w:hAnsi="Times New Roman" w:eastAsia="Times New Roman"/>
-                <w:b w:val="0"/>
-                <w:i w:val="0"/>
-                <w:sz w:val="24"/>
-              </w:rPr>
-              <w:t>Общее</w:t>
-            </w:r>
-          </w:p>
-        </w:tc>
-        <w:tc>
-          <w:tcPr>
-            <w:tcW w:type="dxa" w:w="4844"/>
-          </w:tcPr>
-          <w:p>
-            <w:r/>
-            <w:r>
-              <w:rPr>
-                <w:rFonts w:ascii="Times New Roman" w:hAnsi="Times New Roman" w:eastAsia="Times New Roman"/>
-                <w:b w:val="0"/>
-                <w:i w:val="0"/>
-                <w:sz w:val="24"/>
-              </w:rPr>
-              <w:t>Главный документ, КЕ, решение, дополнительные поля</w:t>
-            </w:r>
-          </w:p>
-        </w:tc>
-      </w:tr>
-      <w:tr>
-        <w:tc>
-          <w:tcPr>
-            <w:tcW w:type="dxa" w:w="4844"/>
-          </w:tcPr>
-          <w:p>
-            <w:r/>
-            <w:r>
-              <w:rPr>
-                <w:rFonts w:ascii="Times New Roman" w:hAnsi="Times New Roman" w:eastAsia="Times New Roman"/>
-                <w:b w:val="0"/>
-                <w:i w:val="0"/>
-                <w:sz w:val="24"/>
-              </w:rPr>
-              <w:t>Обращения</w:t>
-            </w:r>
-          </w:p>
-        </w:tc>
-        <w:tc>
-          <w:tcPr>
-            <w:tcW w:type="dxa" w:w="4844"/>
-          </w:tcPr>
-          <w:p>
-            <w:r/>
-            <w:r>
-              <w:rPr>
-                <w:rFonts w:ascii="Times New Roman" w:hAnsi="Times New Roman" w:eastAsia="Times New Roman"/>
-                <w:b w:val="0"/>
-                <w:i w:val="0"/>
-                <w:sz w:val="24"/>
-              </w:rPr>
-              <w:t>Связанные обращения</w:t>
-            </w:r>
-          </w:p>
-        </w:tc>
-      </w:tr>
-      <w:tr>
-        <w:tc>
-          <w:tcPr>
-            <w:tcW w:type="dxa" w:w="4844"/>
-          </w:tcPr>
-          <w:p>
-            <w:r/>
-            <w:r>
-              <w:rPr>
-                <w:rFonts w:ascii="Times New Roman" w:hAnsi="Times New Roman" w:eastAsia="Times New Roman"/>
-                <w:b w:val="0"/>
-                <w:i w:val="0"/>
-                <w:sz w:val="24"/>
-              </w:rPr>
-              <w:t>Работы</w:t>
-            </w:r>
-          </w:p>
-        </w:tc>
-        <w:tc>
-          <w:tcPr>
-            <w:tcW w:type="dxa" w:w="4844"/>
-          </w:tcPr>
-          <w:p>
-            <w:r/>
-            <w:r>
-              <w:rPr>
-                <w:rFonts w:ascii="Times New Roman" w:hAnsi="Times New Roman" w:eastAsia="Times New Roman"/>
-                <w:b w:val="0"/>
-                <w:i w:val="0"/>
-                <w:sz w:val="24"/>
-              </w:rPr>
-              <w:t>Наряды по изменению, последовательность работ</w:t>
-            </w:r>
-          </w:p>
-        </w:tc>
-      </w:tr>
-      <w:tr>
-        <w:tc>
-          <w:tcPr>
-            <w:tcW w:type="dxa" w:w="4844"/>
-          </w:tcPr>
-          <w:p>
-            <w:r/>
-            <w:r>
-              <w:rPr>
-                <w:rFonts w:ascii="Times New Roman" w:hAnsi="Times New Roman" w:eastAsia="Times New Roman"/>
-                <w:b w:val="0"/>
-                <w:i w:val="0"/>
-                <w:sz w:val="24"/>
-              </w:rPr>
-              <w:t>Связи</w:t>
-            </w:r>
-          </w:p>
-        </w:tc>
-        <w:tc>
-          <w:tcPr>
-            <w:tcW w:type="dxa" w:w="4844"/>
-          </w:tcPr>
-          <w:p>
-            <w:r/>
-            <w:r>
-              <w:rPr>
-                <w:rFonts w:ascii="Times New Roman" w:hAnsi="Times New Roman" w:eastAsia="Times New Roman"/>
-                <w:b w:val="0"/>
-                <w:i w:val="0"/>
-                <w:sz w:val="24"/>
-              </w:rPr>
-              <w:t>Связанные документы, статьи БЗ</w:t>
-            </w:r>
-          </w:p>
-        </w:tc>
-      </w:tr>
-      <w:tr>
-        <w:tc>
-          <w:tcPr>
-            <w:tcW w:type="dxa" w:w="4844"/>
-          </w:tcPr>
-          <w:p>
-            <w:r/>
-            <w:r>
-              <w:rPr>
-                <w:rFonts w:ascii="Times New Roman" w:hAnsi="Times New Roman" w:eastAsia="Times New Roman"/>
-                <w:b w:val="0"/>
-                <w:i w:val="0"/>
-                <w:sz w:val="24"/>
-              </w:rPr>
-              <w:t>Файлы</w:t>
-            </w:r>
-          </w:p>
-        </w:tc>
-        <w:tc>
-          <w:tcPr>
-            <w:tcW w:type="dxa" w:w="4844"/>
-          </w:tcPr>
-          <w:p>
-            <w:r/>
-            <w:r>
-              <w:rPr>
-                <w:rFonts w:ascii="Times New Roman" w:hAnsi="Times New Roman" w:eastAsia="Times New Roman"/>
-                <w:b w:val="0"/>
-                <w:i w:val="0"/>
-                <w:sz w:val="24"/>
-              </w:rPr>
-              <w:t>Прикреплённые файлы</w:t>
-            </w:r>
-          </w:p>
-        </w:tc>
-      </w:tr>
-      <w:tr>
-        <w:tc>
-          <w:tcPr>
-            <w:tcW w:type="dxa" w:w="4844"/>
-          </w:tcPr>
-          <w:p>
-            <w:r/>
-            <w:r>
-              <w:rPr>
-                <w:rFonts w:ascii="Times New Roman" w:hAnsi="Times New Roman" w:eastAsia="Times New Roman"/>
-                <w:b w:val="0"/>
-                <w:i w:val="0"/>
-                <w:sz w:val="24"/>
-              </w:rPr>
-              <w:t>Согласование</w:t>
-            </w:r>
-          </w:p>
-        </w:tc>
-        <w:tc>
-          <w:tcPr>
-            <w:tcW w:type="dxa" w:w="4844"/>
-          </w:tcPr>
-          <w:p>
-            <w:r/>
-            <w:r>
-              <w:rPr>
-                <w:rFonts w:ascii="Times New Roman" w:hAnsi="Times New Roman" w:eastAsia="Times New Roman"/>
-                <w:b w:val="0"/>
-                <w:i w:val="0"/>
-                <w:sz w:val="24"/>
-              </w:rPr>
-              <w:t>Задачи и цепочка согласования</w:t>
-            </w:r>
-          </w:p>
-        </w:tc>
-      </w:tr>
-      <w:tr>
-        <w:tc>
-          <w:tcPr>
-            <w:tcW w:type="dxa" w:w="4844"/>
-          </w:tcPr>
-          <w:p>
-            <w:r/>
-            <w:r>
-              <w:rPr>
-                <w:rFonts w:ascii="Times New Roman" w:hAnsi="Times New Roman" w:eastAsia="Times New Roman"/>
-                <w:b w:val="0"/>
-                <w:i w:val="0"/>
-                <w:sz w:val="24"/>
-              </w:rPr>
-              <w:t>История</w:t>
-            </w:r>
-          </w:p>
-        </w:tc>
-        <w:tc>
-          <w:tcPr>
-            <w:tcW w:type="dxa" w:w="4844"/>
-          </w:tcPr>
-          <w:p>
-            <w:r/>
-            <w:r>
-              <w:rPr>
-                <w:rFonts w:ascii="Times New Roman" w:hAnsi="Times New Roman" w:eastAsia="Times New Roman"/>
-                <w:b w:val="0"/>
-                <w:i w:val="0"/>
-                <w:sz w:val="24"/>
-              </w:rPr>
-              <w:t>История смены состояний и ответственных</w:t>
-            </w:r>
-          </w:p>
-        </w:tc>
-      </w:tr>
-      <w:tr>
-        <w:tc>
-          <w:tcPr>
-            <w:tcW w:type="dxa" w:w="4844"/>
-          </w:tcPr>
-          <w:p>
-            <w:r/>
-            <w:r>
-              <w:rPr>
-                <w:rFonts w:ascii="Times New Roman" w:hAnsi="Times New Roman" w:eastAsia="Times New Roman"/>
-                <w:b w:val="0"/>
-                <w:i w:val="0"/>
-                <w:sz w:val="24"/>
-              </w:rPr>
-              <w:t>Уведомления</w:t>
-            </w:r>
-          </w:p>
-        </w:tc>
-        <w:tc>
-          <w:tcPr>
-            <w:tcW w:type="dxa" w:w="4844"/>
-          </w:tcPr>
-          <w:p>
-            <w:r/>
-            <w:r>
-              <w:rPr>
-                <w:rFonts w:ascii="Times New Roman" w:hAnsi="Times New Roman" w:eastAsia="Times New Roman"/>
-                <w:b w:val="0"/>
-                <w:i w:val="0"/>
-                <w:sz w:val="24"/>
-              </w:rPr>
-              <w:t>Отправленные уведомления</w:t>
-            </w:r>
-          </w:p>
-        </w:tc>
-      </w:tr>
-    </w:tbl>
-    <w:p/>
-    <w:p>
-      <w:pPr>
-        <w:pStyle w:val="Heading1"/>
-      </w:pPr>
-      <w:r>
-        <w:t>10. Задача «Согласование изменений»</w:t>
-      </w:r>
-    </w:p>
-    <w:p>
-      <w:r>
-        <w:rPr>
-          <w:rFonts w:ascii="Times New Roman" w:hAnsi="Times New Roman" w:eastAsia="Times New Roman"/>
-          <w:b w:val="0"/>
-          <w:i w:val="0"/>
-          <w:sz w:val="28"/>
-        </w:rPr>
-        <w:t>Задачи формируются автоматически при начале согласования. Доступны по ссылке «Все согласования изменений».</w:t>
-      </w:r>
-    </w:p>
-    <w:tbl>
-      <w:tblPr>
-        <w:tblStyle w:val="TableGrid"/>
-        <w:tblW w:type="auto" w:w="0"/>
-        <w:tblLook w:firstColumn="1" w:firstRow="1" w:lastColumn="0" w:lastRow="0" w:noHBand="0" w:noVBand="1" w:val="04A0"/>
-      </w:tblPr>
-      <w:tblGrid>
-        <w:gridCol w:w="4844"/>
-        <w:gridCol w:w="4844"/>
-      </w:tblGrid>
-      <w:tr>
-        <w:tc>
-          <w:tcPr>
-            <w:tcW w:type="dxa" w:w="4844"/>
-            <w:shd w:fill="003366"/>
-          </w:tcPr>
-          <w:p>
-            <w:pPr>
-              <w:jc w:val="center"/>
-            </w:pPr>
-            <w:r/>
-            <w:r>
-              <w:rPr>
-                <w:rFonts w:ascii="Times New Roman" w:hAnsi="Times New Roman" w:eastAsia="Times New Roman"/>
-                <w:b/>
-                <w:i w:val="0"/>
-                <w:color w:val="FFFFFF"/>
-                <w:sz w:val="24"/>
-              </w:rPr>
-              <w:t>Кнопка</w:t>
-            </w:r>
-          </w:p>
-        </w:tc>
-        <w:tc>
-          <w:tcPr>
-            <w:tcW w:type="dxa" w:w="4844"/>
-            <w:shd w:fill="003366"/>
-          </w:tcPr>
-          <w:p>
-            <w:pPr>
-              <w:jc w:val="center"/>
-            </w:pPr>
-            <w:r/>
-            <w:r>
-              <w:rPr>
-                <w:rFonts w:ascii="Times New Roman" w:hAnsi="Times New Roman" w:eastAsia="Times New Roman"/>
-                <w:b/>
-                <w:i w:val="0"/>
-                <w:color w:val="FFFFFF"/>
-                <w:sz w:val="24"/>
-              </w:rPr>
-              <w:t>Действие</w:t>
-            </w:r>
-          </w:p>
-        </w:tc>
-      </w:tr>
-      <w:tr>
-        <w:tc>
-          <w:tcPr>
-            <w:tcW w:type="dxa" w:w="4844"/>
-          </w:tcPr>
-          <w:p>
-            <w:r/>
-            <w:r>
-              <w:rPr>
-                <w:rFonts w:ascii="Times New Roman" w:hAnsi="Times New Roman" w:eastAsia="Times New Roman"/>
-                <w:b w:val="0"/>
-                <w:i w:val="0"/>
-                <w:sz w:val="24"/>
-              </w:rPr>
-              <w:t>Утвердить</w:t>
-            </w:r>
-          </w:p>
-        </w:tc>
-        <w:tc>
-          <w:tcPr>
-            <w:tcW w:type="dxa" w:w="4844"/>
-          </w:tcPr>
-          <w:p>
-            <w:r/>
-            <w:r>
-              <w:rPr>
-                <w:rFonts w:ascii="Times New Roman" w:hAnsi="Times New Roman" w:eastAsia="Times New Roman"/>
-                <w:b w:val="0"/>
-                <w:i w:val="0"/>
-                <w:sz w:val="24"/>
-              </w:rPr>
-              <w:t>Согласование без замечаний → следующий уровень или состояние «Если согласовано»</w:t>
-            </w:r>
-          </w:p>
-        </w:tc>
-      </w:tr>
-      <w:tr>
-        <w:tc>
-          <w:tcPr>
-            <w:tcW w:type="dxa" w:w="4844"/>
-          </w:tcPr>
-          <w:p>
-            <w:r/>
-            <w:r>
-              <w:rPr>
-                <w:rFonts w:ascii="Times New Roman" w:hAnsi="Times New Roman" w:eastAsia="Times New Roman"/>
-                <w:b w:val="0"/>
-                <w:i w:val="0"/>
-                <w:sz w:val="24"/>
-              </w:rPr>
-              <w:t>Утвердить с замечаниями</w:t>
-            </w:r>
-          </w:p>
-        </w:tc>
-        <w:tc>
-          <w:tcPr>
-            <w:tcW w:type="dxa" w:w="4844"/>
-          </w:tcPr>
-          <w:p>
-            <w:r/>
-            <w:r>
-              <w:rPr>
-                <w:rFonts w:ascii="Times New Roman" w:hAnsi="Times New Roman" w:eastAsia="Times New Roman"/>
-                <w:b w:val="0"/>
-                <w:i w:val="0"/>
-                <w:sz w:val="24"/>
-              </w:rPr>
-              <w:t>Согласование с замечаниями → состояние «Если согласовано с замечаниями»</w:t>
-            </w:r>
-          </w:p>
-        </w:tc>
-      </w:tr>
-      <w:tr>
-        <w:tc>
-          <w:tcPr>
-            <w:tcW w:type="dxa" w:w="4844"/>
-          </w:tcPr>
-          <w:p>
-            <w:r/>
-            <w:r>
-              <w:rPr>
-                <w:rFonts w:ascii="Times New Roman" w:hAnsi="Times New Roman" w:eastAsia="Times New Roman"/>
-                <w:b w:val="0"/>
-                <w:i w:val="0"/>
-                <w:sz w:val="24"/>
-              </w:rPr>
-              <w:t>Отклонить</w:t>
-            </w:r>
-          </w:p>
-        </w:tc>
-        <w:tc>
-          <w:tcPr>
-            <w:tcW w:type="dxa" w:w="4844"/>
-          </w:tcPr>
-          <w:p>
-            <w:r/>
-            <w:r>
-              <w:rPr>
-                <w:rFonts w:ascii="Times New Roman" w:hAnsi="Times New Roman" w:eastAsia="Times New Roman"/>
-                <w:b w:val="0"/>
-                <w:i w:val="0"/>
-                <w:sz w:val="24"/>
-              </w:rPr>
-              <w:t>Отклонение → состояние «Если отклонено»</w:t>
-            </w:r>
-          </w:p>
-        </w:tc>
-      </w:tr>
-    </w:tbl>
-    <w:p/>
-    <w:p>
-      <w:pPr>
-        <w:pStyle w:val="Heading1"/>
-      </w:pPr>
-      <w:r>
-        <w:t>11. Схема связей справочников</w:t>
+        <w:t>Коды закрытия дают аналитику результата выполнения изменения и используются в документе «Изменение», а также могут подставляться по умолчанию из состояния.</w:t>
       </w:r>
     </w:p>
     <w:p>
@@ -3581,15 +1064,7 @@
           <w:i w:val="0"/>
           <w:sz w:val="28"/>
         </w:rPr>
-        <w:t>Документ «Изменение» использует: Типы изменений, Категории документов, Приоритеты, Состояния изменений, Коды закрытия. При согласовании задействуется справочник «Комитеты по изменениям», который формирует задачи «Согласование изменений».</w:t>
-      </w:r>
-    </w:p>
-    <w:p>
-      <w:pPr>
-        <w:pStyle w:val="Heading1"/>
-      </w:pPr>
-      <w:r>
-        <w:t>12. Практический сценарий настройки с нуля</w:t>
+        <w:t>Примеры кодов:</w:t>
       </w:r>
     </w:p>
     <w:p>
@@ -3604,7 +1079,7 @@
           <w:i w:val="0"/>
           <w:sz w:val="28"/>
         </w:rPr>
-        <w:t>Шаг 1: Создать коды закрытия: Успешно, С замечаниями, Отменено, Не выполнено.</w:t>
+        <w:t>Закрыто успешно</w:t>
       </w:r>
     </w:p>
     <w:p>
@@ -3619,7 +1094,7 @@
           <w:i w:val="0"/>
           <w:sz w:val="28"/>
         </w:rPr>
-        <w:t>Шаг 2: Создать состояния и настроить матрицу переходов. «Новое» — по умолчанию.</w:t>
+        <w:t>Закрыто с отклонением от плана</w:t>
       </w:r>
     </w:p>
     <w:p>
@@ -3634,7 +1109,7 @@
           <w:i w:val="0"/>
           <w:sz w:val="28"/>
         </w:rPr>
-        <w:t>Шаг 3: Создать комитеты CAB с уровнями согласования и результатами.</w:t>
+        <w:t>Отменено инициатором</w:t>
       </w:r>
     </w:p>
     <w:p>
@@ -3649,7 +1124,40 @@
           <w:i w:val="0"/>
           <w:sz w:val="28"/>
         </w:rPr>
-        <w:t>Шаг 4: Создать типы изменений и привязать комитеты.</w:t>
+        <w:t>Не реализовано — нет ресурсов</w:t>
+      </w:r>
+    </w:p>
+    <w:p>
+      <w:pPr>
+        <w:pStyle w:val="Heading1"/>
+      </w:pPr>
+      <w:r>
+        <w:t>8. Документ «Изменение» и общение (как на скриншоте)</w:t>
+      </w:r>
+    </w:p>
+    <w:p>
+      <w:r>
+        <w:rPr>
+          <w:rFonts w:ascii="Times New Roman" w:hAnsi="Times New Roman" w:eastAsia="Times New Roman"/>
+          <w:b w:val="0"/>
+          <w:i w:val="0"/>
+          <w:sz w:val="28"/>
+        </w:rPr>
+        <w:t>В документе «Изменение» заполняются ключевые поля (тип, приоритет, состояние и т.д.), а также используется «Общение по изменению».</w:t>
+      </w:r>
+    </w:p>
+    <w:p>
+      <w:pPr>
+        <w:ind w:firstLine="0"/>
+      </w:pPr>
+      <w:r>
+        <w:rPr>
+          <w:rFonts w:ascii="Times New Roman" w:hAnsi="Times New Roman" w:eastAsia="Times New Roman"/>
+          <w:b w:val="0"/>
+          <w:i w:val="0"/>
+          <w:sz w:val="28"/>
+        </w:rPr>
+        <w:t>Рекомендации по работе с общением:</w:t>
       </w:r>
     </w:p>
     <w:p>
@@ -3664,7 +1172,7 @@
           <w:i w:val="0"/>
           <w:sz w:val="28"/>
         </w:rPr>
-        <w:t>Шаг 5: Заполнить категории и приоритеты для изменений.</w:t>
+        <w:t>Для фиксации договорённостей используйте «Общение с инициатором».</w:t>
       </w:r>
     </w:p>
     <w:p>
@@ -3679,7 +1187,22 @@
           <w:i w:val="0"/>
           <w:sz w:val="28"/>
         </w:rPr>
-        <w:t>Шаг 6: Создать тестовое изменение и пройти полный цикл до закрытия.</w:t>
+        <w:t>Для внутренней переписки команды — «Внутреннее общение» (инициатор не видит).</w:t>
+      </w:r>
+    </w:p>
+    <w:p>
+      <w:pPr>
+        <w:pStyle w:val="ListBullet"/>
+        <w:ind w:firstLine="0" w:left="709"/>
+      </w:pPr>
+      <w:r>
+        <w:rPr>
+          <w:rFonts w:ascii="Times New Roman" w:hAnsi="Times New Roman" w:eastAsia="Times New Roman"/>
+          <w:b w:val="0"/>
+          <w:i w:val="0"/>
+          <w:sz w:val="28"/>
+        </w:rPr>
+        <w:t>Подписывайте нужных пользователей, чтобы они получали уведомления о новых сообщениях.</w:t>
       </w:r>
     </w:p>
     <w:p>
@@ -3687,422 +1210,9 @@
         <w:pStyle w:val="Heading1"/>
       </w:pPr>
       <w:r>
-        <w:t>13. Роли для работы со справочниками</w:t>
+        <w:t>9. Приложение: ваши скриншоты</w:t>
       </w:r>
     </w:p>
-    <w:tbl>
-      <w:tblPr>
-        <w:tblStyle w:val="TableGrid"/>
-        <w:tblW w:type="auto" w:w="0"/>
-        <w:tblLook w:firstColumn="1" w:firstRow="1" w:lastColumn="0" w:lastRow="0" w:noHBand="0" w:noVBand="1" w:val="04A0"/>
-      </w:tblPr>
-      <w:tblGrid>
-        <w:gridCol w:w="4844"/>
-        <w:gridCol w:w="4844"/>
-      </w:tblGrid>
-      <w:tr>
-        <w:tc>
-          <w:tcPr>
-            <w:tcW w:type="dxa" w:w="4844"/>
-            <w:shd w:fill="003366"/>
-          </w:tcPr>
-          <w:p>
-            <w:pPr>
-              <w:jc w:val="center"/>
-            </w:pPr>
-            <w:r/>
-            <w:r>
-              <w:rPr>
-                <w:rFonts w:ascii="Times New Roman" w:hAnsi="Times New Roman" w:eastAsia="Times New Roman"/>
-                <w:b/>
-                <w:i w:val="0"/>
-                <w:color w:val="FFFFFF"/>
-                <w:sz w:val="24"/>
-              </w:rPr>
-              <w:t>Роль</w:t>
-            </w:r>
-          </w:p>
-        </w:tc>
-        <w:tc>
-          <w:tcPr>
-            <w:tcW w:type="dxa" w:w="4844"/>
-            <w:shd w:fill="003366"/>
-          </w:tcPr>
-          <w:p>
-            <w:pPr>
-              <w:jc w:val="center"/>
-            </w:pPr>
-            <w:r/>
-            <w:r>
-              <w:rPr>
-                <w:rFonts w:ascii="Times New Roman" w:hAnsi="Times New Roman" w:eastAsia="Times New Roman"/>
-                <w:b/>
-                <w:i w:val="0"/>
-                <w:color w:val="FFFFFF"/>
-                <w:sz w:val="24"/>
-              </w:rPr>
-              <w:t>Доступ</w:t>
-            </w:r>
-          </w:p>
-        </w:tc>
-      </w:tr>
-      <w:tr>
-        <w:tc>
-          <w:tcPr>
-            <w:tcW w:type="dxa" w:w="4844"/>
-          </w:tcPr>
-          <w:p>
-            <w:r/>
-            <w:r>
-              <w:rPr>
-                <w:rFonts w:ascii="Times New Roman" w:hAnsi="Times New Roman" w:eastAsia="Times New Roman"/>
-                <w:b w:val="0"/>
-                <w:i w:val="0"/>
-                <w:sz w:val="24"/>
-              </w:rPr>
-              <w:t>Настройка системы</w:t>
-            </w:r>
-          </w:p>
-        </w:tc>
-        <w:tc>
-          <w:tcPr>
-            <w:tcW w:type="dxa" w:w="4844"/>
-          </w:tcPr>
-          <w:p>
-            <w:r/>
-            <w:r>
-              <w:rPr>
-                <w:rFonts w:ascii="Times New Roman" w:hAnsi="Times New Roman" w:eastAsia="Times New Roman"/>
-                <w:b w:val="0"/>
-                <w:i w:val="0"/>
-                <w:sz w:val="24"/>
-              </w:rPr>
-              <w:t>Все справочники изменений</w:t>
-            </w:r>
-          </w:p>
-        </w:tc>
-      </w:tr>
-      <w:tr>
-        <w:tc>
-          <w:tcPr>
-            <w:tcW w:type="dxa" w:w="4844"/>
-          </w:tcPr>
-          <w:p>
-            <w:r/>
-            <w:r>
-              <w:rPr>
-                <w:rFonts w:ascii="Times New Roman" w:hAnsi="Times New Roman" w:eastAsia="Times New Roman"/>
-                <w:b w:val="0"/>
-                <w:i w:val="0"/>
-                <w:sz w:val="24"/>
-              </w:rPr>
-              <w:t>Настройка согласования изменений</w:t>
-            </w:r>
-          </w:p>
-        </w:tc>
-        <w:tc>
-          <w:tcPr>
-            <w:tcW w:type="dxa" w:w="4844"/>
-          </w:tcPr>
-          <w:p>
-            <w:r/>
-            <w:r>
-              <w:rPr>
-                <w:rFonts w:ascii="Times New Roman" w:hAnsi="Times New Roman" w:eastAsia="Times New Roman"/>
-                <w:b w:val="0"/>
-                <w:i w:val="0"/>
-                <w:sz w:val="24"/>
-              </w:rPr>
-              <w:t>Комитеты, типы</w:t>
-            </w:r>
-          </w:p>
-        </w:tc>
-      </w:tr>
-      <w:tr>
-        <w:tc>
-          <w:tcPr>
-            <w:tcW w:type="dxa" w:w="4844"/>
-          </w:tcPr>
-          <w:p>
-            <w:r/>
-            <w:r>
-              <w:rPr>
-                <w:rFonts w:ascii="Times New Roman" w:hAnsi="Times New Roman" w:eastAsia="Times New Roman"/>
-                <w:b w:val="0"/>
-                <w:i w:val="0"/>
-                <w:sz w:val="24"/>
-              </w:rPr>
-              <w:t>Полные права</w:t>
-            </w:r>
-          </w:p>
-        </w:tc>
-        <w:tc>
-          <w:tcPr>
-            <w:tcW w:type="dxa" w:w="4844"/>
-          </w:tcPr>
-          <w:p>
-            <w:r/>
-            <w:r>
-              <w:rPr>
-                <w:rFonts w:ascii="Times New Roman" w:hAnsi="Times New Roman" w:eastAsia="Times New Roman"/>
-                <w:b w:val="0"/>
-                <w:i w:val="0"/>
-                <w:sz w:val="24"/>
-              </w:rPr>
-              <w:t>Полный доступ, все задачи согласования</w:t>
-            </w:r>
-          </w:p>
-        </w:tc>
-      </w:tr>
-    </w:tbl>
-    <w:p/>
-    <w:p>
-      <w:pPr>
-        <w:pStyle w:val="Heading1"/>
-      </w:pPr>
-      <w:r>
-        <w:t>14. Полезные ссылки</w:t>
-      </w:r>
-    </w:p>
-    <w:tbl>
-      <w:tblPr>
-        <w:tblStyle w:val="TableGrid"/>
-        <w:tblW w:type="auto" w:w="0"/>
-        <w:tblLook w:firstColumn="1" w:firstRow="1" w:lastColumn="0" w:lastRow="0" w:noHBand="0" w:noVBand="1" w:val="04A0"/>
-      </w:tblPr>
-      <w:tblGrid>
-        <w:gridCol w:w="4844"/>
-        <w:gridCol w:w="4844"/>
-      </w:tblGrid>
-      <w:tr>
-        <w:tc>
-          <w:tcPr>
-            <w:tcW w:type="dxa" w:w="4844"/>
-            <w:shd w:fill="003366"/>
-          </w:tcPr>
-          <w:p>
-            <w:pPr>
-              <w:jc w:val="center"/>
-            </w:pPr>
-            <w:r/>
-            <w:r>
-              <w:rPr>
-                <w:rFonts w:ascii="Times New Roman" w:hAnsi="Times New Roman" w:eastAsia="Times New Roman"/>
-                <w:b/>
-                <w:i w:val="0"/>
-                <w:color w:val="FFFFFF"/>
-                <w:sz w:val="24"/>
-              </w:rPr>
-              <w:t>Раздел</w:t>
-            </w:r>
-          </w:p>
-        </w:tc>
-        <w:tc>
-          <w:tcPr>
-            <w:tcW w:type="dxa" w:w="4844"/>
-            <w:shd w:fill="003366"/>
-          </w:tcPr>
-          <w:p>
-            <w:pPr>
-              <w:jc w:val="center"/>
-            </w:pPr>
-            <w:r/>
-            <w:r>
-              <w:rPr>
-                <w:rFonts w:ascii="Times New Roman" w:hAnsi="Times New Roman" w:eastAsia="Times New Roman"/>
-                <w:b/>
-                <w:i w:val="0"/>
-                <w:color w:val="FFFFFF"/>
-                <w:sz w:val="24"/>
-              </w:rPr>
-              <w:t>URL</w:t>
-            </w:r>
-          </w:p>
-        </w:tc>
-      </w:tr>
-      <w:tr>
-        <w:tc>
-          <w:tcPr>
-            <w:tcW w:type="dxa" w:w="4844"/>
-          </w:tcPr>
-          <w:p>
-            <w:r/>
-            <w:r>
-              <w:rPr>
-                <w:rFonts w:ascii="Times New Roman" w:hAnsi="Times New Roman" w:eastAsia="Times New Roman"/>
-                <w:b w:val="0"/>
-                <w:i w:val="0"/>
-                <w:sz w:val="24"/>
-              </w:rPr>
-              <w:t>Управление изменениями</w:t>
-            </w:r>
-          </w:p>
-        </w:tc>
-        <w:tc>
-          <w:tcPr>
-            <w:tcW w:type="dxa" w:w="4844"/>
-          </w:tcPr>
-          <w:p>
-            <w:r/>
-            <w:r>
-              <w:rPr>
-                <w:rFonts w:ascii="Times New Roman" w:hAnsi="Times New Roman" w:eastAsia="Times New Roman"/>
-                <w:b w:val="0"/>
-                <w:i w:val="0"/>
-                <w:sz w:val="24"/>
-              </w:rPr>
-              <w:t>https://1c-itilium.ru/manual/user/change</w:t>
-            </w:r>
-          </w:p>
-        </w:tc>
-      </w:tr>
-      <w:tr>
-        <w:tc>
-          <w:tcPr>
-            <w:tcW w:type="dxa" w:w="4844"/>
-          </w:tcPr>
-          <w:p>
-            <w:r/>
-            <w:r>
-              <w:rPr>
-                <w:rFonts w:ascii="Times New Roman" w:hAnsi="Times New Roman" w:eastAsia="Times New Roman"/>
-                <w:b w:val="0"/>
-                <w:i w:val="0"/>
-                <w:sz w:val="24"/>
-              </w:rPr>
-              <w:t>Общие справочники</w:t>
-            </w:r>
-          </w:p>
-        </w:tc>
-        <w:tc>
-          <w:tcPr>
-            <w:tcW w:type="dxa" w:w="4844"/>
-          </w:tcPr>
-          <w:p>
-            <w:r/>
-            <w:r>
-              <w:rPr>
-                <w:rFonts w:ascii="Times New Roman" w:hAnsi="Times New Roman" w:eastAsia="Times New Roman"/>
-                <w:b w:val="0"/>
-                <w:i w:val="0"/>
-                <w:sz w:val="24"/>
-              </w:rPr>
-              <w:t>https://1c-itilium.ru/manual/user/functions/directory</w:t>
-            </w:r>
-          </w:p>
-        </w:tc>
-      </w:tr>
-      <w:tr>
-        <w:tc>
-          <w:tcPr>
-            <w:tcW w:type="dxa" w:w="4844"/>
-          </w:tcPr>
-          <w:p>
-            <w:r/>
-            <w:r>
-              <w:rPr>
-                <w:rFonts w:ascii="Times New Roman" w:hAnsi="Times New Roman" w:eastAsia="Times New Roman"/>
-                <w:b w:val="0"/>
-                <w:i w:val="0"/>
-                <w:sz w:val="24"/>
-              </w:rPr>
-              <w:t>Матрица переходов</w:t>
-            </w:r>
-          </w:p>
-        </w:tc>
-        <w:tc>
-          <w:tcPr>
-            <w:tcW w:type="dxa" w:w="4844"/>
-          </w:tcPr>
-          <w:p>
-            <w:r/>
-            <w:r>
-              <w:rPr>
-                <w:rFonts w:ascii="Times New Roman" w:hAnsi="Times New Roman" w:eastAsia="Times New Roman"/>
-                <w:b w:val="0"/>
-                <w:i w:val="0"/>
-                <w:sz w:val="24"/>
-              </w:rPr>
-              <w:t>https://1c-itilium.ru/manual/user/functions/matrix</w:t>
-            </w:r>
-          </w:p>
-        </w:tc>
-      </w:tr>
-      <w:tr>
-        <w:tc>
-          <w:tcPr>
-            <w:tcW w:type="dxa" w:w="4844"/>
-          </w:tcPr>
-          <w:p>
-            <w:r/>
-            <w:r>
-              <w:rPr>
-                <w:rFonts w:ascii="Times New Roman" w:hAnsi="Times New Roman" w:eastAsia="Times New Roman"/>
-                <w:b w:val="0"/>
-                <w:i w:val="0"/>
-                <w:sz w:val="24"/>
-              </w:rPr>
-              <w:t>Правила обработки</w:t>
-            </w:r>
-          </w:p>
-        </w:tc>
-        <w:tc>
-          <w:tcPr>
-            <w:tcW w:type="dxa" w:w="4844"/>
-          </w:tcPr>
-          <w:p>
-            <w:r/>
-            <w:r>
-              <w:rPr>
-                <w:rFonts w:ascii="Times New Roman" w:hAnsi="Times New Roman" w:eastAsia="Times New Roman"/>
-                <w:b w:val="0"/>
-                <w:i w:val="0"/>
-                <w:sz w:val="24"/>
-              </w:rPr>
-              <w:t>https://1c-itilium.ru/manual/user/functions/processing</w:t>
-            </w:r>
-          </w:p>
-        </w:tc>
-      </w:tr>
-      <w:tr>
-        <w:tc>
-          <w:tcPr>
-            <w:tcW w:type="dxa" w:w="4844"/>
-          </w:tcPr>
-          <w:p>
-            <w:r/>
-            <w:r>
-              <w:rPr>
-                <w:rFonts w:ascii="Times New Roman" w:hAnsi="Times New Roman" w:eastAsia="Times New Roman"/>
-                <w:b w:val="0"/>
-                <w:i w:val="0"/>
-                <w:sz w:val="24"/>
-              </w:rPr>
-              <w:t>Руководство на ИТС</w:t>
-            </w:r>
-          </w:p>
-        </w:tc>
-        <w:tc>
-          <w:tcPr>
-            <w:tcW w:type="dxa" w:w="4844"/>
-          </w:tcPr>
-          <w:p>
-            <w:r/>
-            <w:r>
-              <w:rPr>
-                <w:rFonts w:ascii="Times New Roman" w:hAnsi="Times New Roman" w:eastAsia="Times New Roman"/>
-                <w:b w:val="0"/>
-                <w:i w:val="0"/>
-                <w:sz w:val="24"/>
-              </w:rPr>
-              <w:t>https://its.1c.ru/db/itilium/content/223/hdoc</w:t>
-            </w:r>
-          </w:p>
-        </w:tc>
-      </w:tr>
-    </w:tbl>
-    <w:p/>
-    <w:p/>
     <w:p>
       <w:pPr>
         <w:ind w:firstLine="0"/>
@@ -4114,7 +1224,7 @@
           <w:i w:val="0"/>
           <w:sz w:val="24"/>
         </w:rPr>
-        <w:t>Источник: официальное руководство пользователя 1С:ITILIUM, разработчик «Деснол». Внешний вид форм может незначительно отличаться в зависимости от версии системы.</w:t>
+        <w:t>Скриншоты в чат-переписке не сохраняются в репозиторий автоматически. Если вы добавите их в репозиторий (например, в папку `docs/screens/`), их можно будет вставить в этот документ как иллюстрации к разделам 4 и 8.</w:t>
       </w:r>
     </w:p>
     <w:sectPr>

</xml_diff>